<commit_message>
Atualiza Working Plan v2.0 e Relatorio MVP v1.1 com mudancas de Maio/2026
</commit_message>
<xml_diff>
--- a/docs/Relatorio MVP - Monitoramento Fatos Relevantes CVM.docx
+++ b/docs/Relatorio MVP - Monitoramento Fatos Relevantes CVM.docx
@@ -51,7 +51,7 @@
     </w:p>
     <w:p>
       <w:pPr>
-        <w:spacing w:after="100"/>
+        <w:spacing w:after="80"/>
         <w:jc w:val="center"/>
       </w:pPr>
       <w:r>
@@ -64,7 +64,7 @@
     </w:p>
     <w:p>
       <w:pPr>
-        <w:spacing w:after="100"/>
+        <w:spacing w:after="80"/>
         <w:jc w:val="center"/>
       </w:pPr>
       <w:r>
@@ -72,7 +72,21 @@
           <w:sz w:val="22"/>
           <w:szCs w:val="22"/>
         </w:rPr>
-        <w:t xml:space="preserve">Versão 1.0 — Maio 2026</w:t>
+        <w:t xml:space="preserve">Versão 1.1 — Maio 2026 (atualizada)</w:t>
+      </w:r>
+    </w:p>
+    <w:p>
+      <w:pPr>
+        <w:spacing w:after="80"/>
+        <w:jc w:val="center"/>
+      </w:pPr>
+      <w:r>
+        <w:rPr>
+          <w:color w:val="555555"/>
+          <w:sz w:val="18"/>
+          <w:szCs w:val="18"/>
+        </w:rPr>
+        <w:t xml:space="preserve">Repositório: github.com/marvin-monitoramento/marvin-cvm-fatos-relevantes</w:t>
       </w:r>
     </w:p>
     <w:p>
@@ -101,7 +115,7 @@
         <w:spacing w:after="120"/>
       </w:pPr>
       <w:r>
-        <w:t xml:space="preserve">Este documento descreve o projeto MVP de Monitoramento Automático de Fatos Relevantes da CVM, construído pela área de Risco da Marvin para detectar proativamente eventos materiais (mudança de auditor, renegociação de covenants, recuperação judicial, fato relevante, comunicado ao mercado, etc.) publicados pelos devedores listados da carteira ativa.</w:t>
+        <w:t xml:space="preserve">Este documento descreve o projeto MVP de Monitoramento Automático de Fatos Relevantes da CVM, construído pela área de Risco da Marvin para detectar proativamente eventos materiais publicados pelos devedores listados da carteira ativa de garantias. O sistema opera de forma autônoma e está sob a organização marvin-monitoramento no GitHub.</w:t>
       </w:r>
     </w:p>
     <w:p>
@@ -109,7 +123,7 @@
         <w:spacing w:after="120"/>
       </w:pPr>
       <w:r>
-        <w:t xml:space="preserve">O sistema roda diariamente de forma autônoma na máquina da responsável, baixa o arquivo IPE oficial da CVM, filtra pelos 20 devedores monitorados, classifica os eventos em três níveis de materialidade (alta, média, baixa) e envia um e-mail estruturado para o time de Risco — com a planilha histórica acumulada como fonte-verdade auditável.</w:t>
+        <w:t xml:space="preserve">Esta versão 1.1 atualiza o documento com as evoluções de Maio/2026: transferência do repositório para a organização Marvin, documentação do procedimento institucional de regeneração do token ClickUp, reorganização das pastas do projeto e remoção da classificação automática de materialidade das saídas visíveis (a critério editorial da responsável).</w:t>
       </w:r>
     </w:p>
     <w:p>
@@ -141,8 +155,8 @@
         </w:tblBorders>
       </w:tblPr>
       <w:tblGrid>
-        <w:gridCol w:w="4500"/>
-        <w:gridCol w:w="4860"/>
+        <w:gridCol w:w="5500"/>
+        <w:gridCol w:w="3860"/>
       </w:tblGrid>
       <w:tr>
         <w:trPr>
@@ -150,7 +164,7 @@
         </w:trPr>
         <w:tc>
           <w:tcPr>
-            <w:tcW w:type="dxa" w:w="4500"/>
+            <w:tcW w:type="dxa" w:w="5500"/>
             <w:tcBorders>
               <w:top w:val="single" w:color="BFBFBF" w:sz="4"/>
               <w:left w:val="single" w:color="BFBFBF" w:sz="4"/>
@@ -180,7 +194,7 @@
         </w:tc>
         <w:tc>
           <w:tcPr>
-            <w:tcW w:type="dxa" w:w="4860"/>
+            <w:tcW w:type="dxa" w:w="3860"/>
             <w:tcBorders>
               <w:top w:val="single" w:color="BFBFBF" w:sz="4"/>
               <w:left w:val="single" w:color="BFBFBF" w:sz="4"/>
@@ -215,35 +229,35 @@
         </w:trPr>
         <w:tc>
           <w:tcPr>
-            <w:tcW w:type="dxa" w:w="4500"/>
-            <w:tcBorders>
-              <w:top w:val="single" w:color="BFBFBF" w:sz="4"/>
-              <w:left w:val="single" w:color="BFBFBF" w:sz="4"/>
-              <w:bottom w:val="single" w:color="BFBFBF" w:sz="4"/>
-              <w:right w:val="single" w:color="BFBFBF" w:sz="4"/>
-            </w:tcBorders>
-            <w:tcMar>
-              <w:top w:type="dxa" w:w="80"/>
-              <w:left w:type="dxa" w:w="120"/>
-              <w:bottom w:type="dxa" w:w="80"/>
-              <w:right w:type="dxa" w:w="120"/>
-            </w:tcMar>
-          </w:tcPr>
-          <w:p>
-            <w:r>
-              <w:rPr>
-                <w:b w:val="false"/>
-                <w:bCs w:val="false"/>
-                <w:sz w:val="18"/>
-                <w:szCs w:val="18"/>
-              </w:rPr>
-              <w:t xml:space="preserve">Pipeline Python coletando da CVM</w:t>
-            </w:r>
-          </w:p>
-        </w:tc>
-        <w:tc>
-          <w:tcPr>
-            <w:tcW w:type="dxa" w:w="4860"/>
+            <w:tcW w:type="dxa" w:w="5500"/>
+            <w:tcBorders>
+              <w:top w:val="single" w:color="BFBFBF" w:sz="4"/>
+              <w:left w:val="single" w:color="BFBFBF" w:sz="4"/>
+              <w:bottom w:val="single" w:color="BFBFBF" w:sz="4"/>
+              <w:right w:val="single" w:color="BFBFBF" w:sz="4"/>
+            </w:tcBorders>
+            <w:tcMar>
+              <w:top w:type="dxa" w:w="80"/>
+              <w:left w:type="dxa" w:w="120"/>
+              <w:bottom w:type="dxa" w:w="80"/>
+              <w:right w:type="dxa" w:w="120"/>
+            </w:tcMar>
+          </w:tcPr>
+          <w:p>
+            <w:r>
+              <w:rPr>
+                <w:b w:val="false"/>
+                <w:bCs w:val="false"/>
+                <w:sz w:val="18"/>
+                <w:szCs w:val="18"/>
+              </w:rPr>
+              <w:t xml:space="preserve">Pipeline Python coletando da CVM (IPE)</w:t>
+            </w:r>
+          </w:p>
+        </w:tc>
+        <w:tc>
+          <w:tcPr>
+            <w:tcW w:type="dxa" w:w="3860"/>
             <w:tcBorders>
               <w:top w:val="single" w:color="BFBFBF" w:sz="4"/>
               <w:left w:val="single" w:color="BFBFBF" w:sz="4"/>
@@ -276,7 +290,7 @@
         </w:trPr>
         <w:tc>
           <w:tcPr>
-            <w:tcW w:type="dxa" w:w="4500"/>
+            <w:tcW w:type="dxa" w:w="5500"/>
             <w:tcBorders>
               <w:top w:val="single" w:color="BFBFBF" w:sz="4"/>
               <w:left w:val="single" w:color="BFBFBF" w:sz="4"/>
@@ -304,7 +318,7 @@
         </w:tc>
         <w:tc>
           <w:tcPr>
-            <w:tcW w:type="dxa" w:w="4860"/>
+            <w:tcW w:type="dxa" w:w="3860"/>
             <w:tcBorders>
               <w:top w:val="single" w:color="BFBFBF" w:sz="4"/>
               <w:left w:val="single" w:color="BFBFBF" w:sz="4"/>
@@ -337,35 +351,35 @@
         </w:trPr>
         <w:tc>
           <w:tcPr>
-            <w:tcW w:type="dxa" w:w="4500"/>
-            <w:tcBorders>
-              <w:top w:val="single" w:color="BFBFBF" w:sz="4"/>
-              <w:left w:val="single" w:color="BFBFBF" w:sz="4"/>
-              <w:bottom w:val="single" w:color="BFBFBF" w:sz="4"/>
-              <w:right w:val="single" w:color="BFBFBF" w:sz="4"/>
-            </w:tcBorders>
-            <w:tcMar>
-              <w:top w:type="dxa" w:w="80"/>
-              <w:left w:type="dxa" w:w="120"/>
-              <w:bottom w:type="dxa" w:w="80"/>
-              <w:right w:type="dxa" w:w="120"/>
-            </w:tcMar>
-          </w:tcPr>
-          <w:p>
-            <w:r>
-              <w:rPr>
-                <w:b w:val="false"/>
-                <w:bCs w:val="false"/>
-                <w:sz w:val="18"/>
-                <w:szCs w:val="18"/>
-              </w:rPr>
-              <w:t xml:space="preserve">Matching por raiz de CNPJ</w:t>
-            </w:r>
-          </w:p>
-        </w:tc>
-        <w:tc>
-          <w:tcPr>
-            <w:tcW w:type="dxa" w:w="4860"/>
+            <w:tcW w:type="dxa" w:w="5500"/>
+            <w:tcBorders>
+              <w:top w:val="single" w:color="BFBFBF" w:sz="4"/>
+              <w:left w:val="single" w:color="BFBFBF" w:sz="4"/>
+              <w:bottom w:val="single" w:color="BFBFBF" w:sz="4"/>
+              <w:right w:val="single" w:color="BFBFBF" w:sz="4"/>
+            </w:tcBorders>
+            <w:tcMar>
+              <w:top w:type="dxa" w:w="80"/>
+              <w:left w:type="dxa" w:w="120"/>
+              <w:bottom w:type="dxa" w:w="80"/>
+              <w:right w:type="dxa" w:w="120"/>
+            </w:tcMar>
+          </w:tcPr>
+          <w:p>
+            <w:r>
+              <w:rPr>
+                <w:b w:val="false"/>
+                <w:bCs w:val="false"/>
+                <w:sz w:val="18"/>
+                <w:szCs w:val="18"/>
+              </w:rPr>
+              <w:t xml:space="preserve">Matching por raiz de CNPJ (matriz + filiais)</w:t>
+            </w:r>
+          </w:p>
+        </w:tc>
+        <w:tc>
+          <w:tcPr>
+            <w:tcW w:type="dxa" w:w="3860"/>
             <w:tcBorders>
               <w:top w:val="single" w:color="BFBFBF" w:sz="4"/>
               <w:left w:val="single" w:color="BFBFBF" w:sz="4"/>
@@ -398,35 +412,35 @@
         </w:trPr>
         <w:tc>
           <w:tcPr>
-            <w:tcW w:type="dxa" w:w="4500"/>
-            <w:tcBorders>
-              <w:top w:val="single" w:color="BFBFBF" w:sz="4"/>
-              <w:left w:val="single" w:color="BFBFBF" w:sz="4"/>
-              <w:bottom w:val="single" w:color="BFBFBF" w:sz="4"/>
-              <w:right w:val="single" w:color="BFBFBF" w:sz="4"/>
-            </w:tcBorders>
-            <w:tcMar>
-              <w:top w:type="dxa" w:w="80"/>
-              <w:left w:type="dxa" w:w="120"/>
-              <w:bottom w:type="dxa" w:w="80"/>
-              <w:right w:type="dxa" w:w="120"/>
-            </w:tcMar>
-          </w:tcPr>
-          <w:p>
-            <w:r>
-              <w:rPr>
-                <w:b w:val="false"/>
-                <w:bCs w:val="false"/>
-                <w:sz w:val="18"/>
-                <w:szCs w:val="18"/>
-              </w:rPr>
-              <w:t xml:space="preserve">Planilha Excel histórica</w:t>
-            </w:r>
-          </w:p>
-        </w:tc>
-        <w:tc>
-          <w:tcPr>
-            <w:tcW w:type="dxa" w:w="4860"/>
+            <w:tcW w:type="dxa" w:w="5500"/>
+            <w:tcBorders>
+              <w:top w:val="single" w:color="BFBFBF" w:sz="4"/>
+              <w:left w:val="single" w:color="BFBFBF" w:sz="4"/>
+              <w:bottom w:val="single" w:color="BFBFBF" w:sz="4"/>
+              <w:right w:val="single" w:color="BFBFBF" w:sz="4"/>
+            </w:tcBorders>
+            <w:tcMar>
+              <w:top w:type="dxa" w:w="80"/>
+              <w:left w:type="dxa" w:w="120"/>
+              <w:bottom w:type="dxa" w:w="80"/>
+              <w:right w:type="dxa" w:w="120"/>
+            </w:tcMar>
+          </w:tcPr>
+          <w:p>
+            <w:r>
+              <w:rPr>
+                <w:b w:val="false"/>
+                <w:bCs w:val="false"/>
+                <w:sz w:val="18"/>
+                <w:szCs w:val="18"/>
+              </w:rPr>
+              <w:t xml:space="preserve">Planilha histórica auditável</w:t>
+            </w:r>
+          </w:p>
+        </w:tc>
+        <w:tc>
+          <w:tcPr>
+            <w:tcW w:type="dxa" w:w="3860"/>
             <w:tcBorders>
               <w:top w:val="single" w:color="BFBFBF" w:sz="4"/>
               <w:left w:val="single" w:color="BFBFBF" w:sz="4"/>
@@ -459,35 +473,35 @@
         </w:trPr>
         <w:tc>
           <w:tcPr>
-            <w:tcW w:type="dxa" w:w="4500"/>
-            <w:tcBorders>
-              <w:top w:val="single" w:color="BFBFBF" w:sz="4"/>
-              <w:left w:val="single" w:color="BFBFBF" w:sz="4"/>
-              <w:bottom w:val="single" w:color="BFBFBF" w:sz="4"/>
-              <w:right w:val="single" w:color="BFBFBF" w:sz="4"/>
-            </w:tcBorders>
-            <w:tcMar>
-              <w:top w:type="dxa" w:w="80"/>
-              <w:left w:type="dxa" w:w="120"/>
-              <w:bottom w:type="dxa" w:w="80"/>
-              <w:right w:type="dxa" w:w="120"/>
-            </w:tcMar>
-          </w:tcPr>
-          <w:p>
-            <w:r>
-              <w:rPr>
-                <w:b w:val="false"/>
-                <w:bCs w:val="false"/>
-                <w:sz w:val="18"/>
-                <w:szCs w:val="18"/>
-              </w:rPr>
-              <w:t xml:space="preserve">E-mail diário via Outlook</w:t>
-            </w:r>
-          </w:p>
-        </w:tc>
-        <w:tc>
-          <w:tcPr>
-            <w:tcW w:type="dxa" w:w="4860"/>
+            <w:tcW w:type="dxa" w:w="5500"/>
+            <w:tcBorders>
+              <w:top w:val="single" w:color="BFBFBF" w:sz="4"/>
+              <w:left w:val="single" w:color="BFBFBF" w:sz="4"/>
+              <w:bottom w:val="single" w:color="BFBFBF" w:sz="4"/>
+              <w:right w:val="single" w:color="BFBFBF" w:sz="4"/>
+            </w:tcBorders>
+            <w:tcMar>
+              <w:top w:type="dxa" w:w="80"/>
+              <w:left w:type="dxa" w:w="120"/>
+              <w:bottom w:type="dxa" w:w="80"/>
+              <w:right w:type="dxa" w:w="120"/>
+            </w:tcMar>
+          </w:tcPr>
+          <w:p>
+            <w:r>
+              <w:rPr>
+                <w:b w:val="false"/>
+                <w:bCs w:val="false"/>
+                <w:sz w:val="18"/>
+                <w:szCs w:val="18"/>
+              </w:rPr>
+              <w:t xml:space="preserve">E-mail diário via Outlook (camada local)</w:t>
+            </w:r>
+          </w:p>
+        </w:tc>
+        <w:tc>
+          <w:tcPr>
+            <w:tcW w:type="dxa" w:w="3860"/>
             <w:tcBorders>
               <w:top w:val="single" w:color="BFBFBF" w:sz="4"/>
               <w:left w:val="single" w:color="BFBFBF" w:sz="4"/>
@@ -520,57 +534,57 @@
         </w:trPr>
         <w:tc>
           <w:tcPr>
-            <w:tcW w:type="dxa" w:w="4500"/>
-            <w:tcBorders>
-              <w:top w:val="single" w:color="BFBFBF" w:sz="4"/>
-              <w:left w:val="single" w:color="BFBFBF" w:sz="4"/>
-              <w:bottom w:val="single" w:color="BFBFBF" w:sz="4"/>
-              <w:right w:val="single" w:color="BFBFBF" w:sz="4"/>
-            </w:tcBorders>
-            <w:tcMar>
-              <w:top w:type="dxa" w:w="80"/>
-              <w:left w:type="dxa" w:w="120"/>
-              <w:bottom w:type="dxa" w:w="80"/>
-              <w:right w:type="dxa" w:w="120"/>
-            </w:tcMar>
-          </w:tcPr>
-          <w:p>
-            <w:r>
-              <w:rPr>
-                <w:b w:val="false"/>
-                <w:bCs w:val="false"/>
-                <w:sz w:val="18"/>
-                <w:szCs w:val="18"/>
-              </w:rPr>
-              <w:t xml:space="preserve">Auto-execução no login do Windows</w:t>
-            </w:r>
-          </w:p>
-        </w:tc>
-        <w:tc>
-          <w:tcPr>
-            <w:tcW w:type="dxa" w:w="4860"/>
-            <w:tcBorders>
-              <w:top w:val="single" w:color="BFBFBF" w:sz="4"/>
-              <w:left w:val="single" w:color="BFBFBF" w:sz="4"/>
-              <w:bottom w:val="single" w:color="BFBFBF" w:sz="4"/>
-              <w:right w:val="single" w:color="BFBFBF" w:sz="4"/>
-            </w:tcBorders>
-            <w:tcMar>
-              <w:top w:type="dxa" w:w="80"/>
-              <w:left w:type="dxa" w:w="120"/>
-              <w:bottom w:type="dxa" w:w="80"/>
-              <w:right w:type="dxa" w:w="120"/>
-            </w:tcMar>
-          </w:tcPr>
-          <w:p>
-            <w:r>
-              <w:rPr>
-                <w:b w:val="false"/>
-                <w:bCs w:val="false"/>
-                <w:sz w:val="18"/>
-                <w:szCs w:val="18"/>
-              </w:rPr>
-              <w:t xml:space="preserve">Configurada</w:t>
+            <w:tcW w:type="dxa" w:w="5500"/>
+            <w:tcBorders>
+              <w:top w:val="single" w:color="BFBFBF" w:sz="4"/>
+              <w:left w:val="single" w:color="BFBFBF" w:sz="4"/>
+              <w:bottom w:val="single" w:color="BFBFBF" w:sz="4"/>
+              <w:right w:val="single" w:color="BFBFBF" w:sz="4"/>
+            </w:tcBorders>
+            <w:tcMar>
+              <w:top w:type="dxa" w:w="80"/>
+              <w:left w:type="dxa" w:w="120"/>
+              <w:bottom w:type="dxa" w:w="80"/>
+              <w:right w:type="dxa" w:w="120"/>
+            </w:tcMar>
+          </w:tcPr>
+          <w:p>
+            <w:r>
+              <w:rPr>
+                <w:b w:val="false"/>
+                <w:bCs w:val="false"/>
+                <w:sz w:val="18"/>
+                <w:szCs w:val="18"/>
+              </w:rPr>
+              <w:t xml:space="preserve">Task no ClickUp + e-mail (camada cloud)</w:t>
+            </w:r>
+          </w:p>
+        </w:tc>
+        <w:tc>
+          <w:tcPr>
+            <w:tcW w:type="dxa" w:w="3860"/>
+            <w:tcBorders>
+              <w:top w:val="single" w:color="BFBFBF" w:sz="4"/>
+              <w:left w:val="single" w:color="BFBFBF" w:sz="4"/>
+              <w:bottom w:val="single" w:color="BFBFBF" w:sz="4"/>
+              <w:right w:val="single" w:color="BFBFBF" w:sz="4"/>
+            </w:tcBorders>
+            <w:tcMar>
+              <w:top w:type="dxa" w:w="80"/>
+              <w:left w:type="dxa" w:w="120"/>
+              <w:bottom w:type="dxa" w:w="80"/>
+              <w:right w:type="dxa" w:w="120"/>
+            </w:tcMar>
+          </w:tcPr>
+          <w:p>
+            <w:r>
+              <w:rPr>
+                <w:b w:val="false"/>
+                <w:bCs w:val="false"/>
+                <w:sz w:val="18"/>
+                <w:szCs w:val="18"/>
+              </w:rPr>
+              <w:t xml:space="preserve">Operacional</w:t>
             </w:r>
           </w:p>
         </w:tc>
@@ -581,57 +595,57 @@
         </w:trPr>
         <w:tc>
           <w:tcPr>
-            <w:tcW w:type="dxa" w:w="4500"/>
-            <w:tcBorders>
-              <w:top w:val="single" w:color="BFBFBF" w:sz="4"/>
-              <w:left w:val="single" w:color="BFBFBF" w:sz="4"/>
-              <w:bottom w:val="single" w:color="BFBFBF" w:sz="4"/>
-              <w:right w:val="single" w:color="BFBFBF" w:sz="4"/>
-            </w:tcBorders>
-            <w:tcMar>
-              <w:top w:type="dxa" w:w="80"/>
-              <w:left w:type="dxa" w:w="120"/>
-              <w:bottom w:type="dxa" w:w="80"/>
-              <w:right w:type="dxa" w:w="120"/>
-            </w:tcMar>
-          </w:tcPr>
-          <w:p>
-            <w:r>
-              <w:rPr>
-                <w:b w:val="false"/>
-                <w:bCs w:val="false"/>
-                <w:sz w:val="18"/>
-                <w:szCs w:val="18"/>
-              </w:rPr>
-              <w:t xml:space="preserve">Manual técnico (PDF)</w:t>
-            </w:r>
-          </w:p>
-        </w:tc>
-        <w:tc>
-          <w:tcPr>
-            <w:tcW w:type="dxa" w:w="4860"/>
-            <w:tcBorders>
-              <w:top w:val="single" w:color="BFBFBF" w:sz="4"/>
-              <w:left w:val="single" w:color="BFBFBF" w:sz="4"/>
-              <w:bottom w:val="single" w:color="BFBFBF" w:sz="4"/>
-              <w:right w:val="single" w:color="BFBFBF" w:sz="4"/>
-            </w:tcBorders>
-            <w:tcMar>
-              <w:top w:type="dxa" w:w="80"/>
-              <w:left w:type="dxa" w:w="120"/>
-              <w:bottom w:type="dxa" w:w="80"/>
-              <w:right w:type="dxa" w:w="120"/>
-            </w:tcMar>
-          </w:tcPr>
-          <w:p>
-            <w:r>
-              <w:rPr>
-                <w:b w:val="false"/>
-                <w:bCs w:val="false"/>
-                <w:sz w:val="18"/>
-                <w:szCs w:val="18"/>
-              </w:rPr>
-              <w:t xml:space="preserve">Entregue</w:t>
+            <w:tcW w:type="dxa" w:w="5500"/>
+            <w:tcBorders>
+              <w:top w:val="single" w:color="BFBFBF" w:sz="4"/>
+              <w:left w:val="single" w:color="BFBFBF" w:sz="4"/>
+              <w:bottom w:val="single" w:color="BFBFBF" w:sz="4"/>
+              <w:right w:val="single" w:color="BFBFBF" w:sz="4"/>
+            </w:tcBorders>
+            <w:tcMar>
+              <w:top w:type="dxa" w:w="80"/>
+              <w:left w:type="dxa" w:w="120"/>
+              <w:bottom w:type="dxa" w:w="80"/>
+              <w:right w:type="dxa" w:w="120"/>
+            </w:tcMar>
+          </w:tcPr>
+          <w:p>
+            <w:r>
+              <w:rPr>
+                <w:b w:val="false"/>
+                <w:bCs w:val="false"/>
+                <w:sz w:val="18"/>
+                <w:szCs w:val="18"/>
+              </w:rPr>
+              <w:t xml:space="preserve">Repositório na organização Marvin no GitHub</w:t>
+            </w:r>
+          </w:p>
+        </w:tc>
+        <w:tc>
+          <w:tcPr>
+            <w:tcW w:type="dxa" w:w="3860"/>
+            <w:tcBorders>
+              <w:top w:val="single" w:color="BFBFBF" w:sz="4"/>
+              <w:left w:val="single" w:color="BFBFBF" w:sz="4"/>
+              <w:bottom w:val="single" w:color="BFBFBF" w:sz="4"/>
+              <w:right w:val="single" w:color="BFBFBF" w:sz="4"/>
+            </w:tcBorders>
+            <w:tcMar>
+              <w:top w:type="dxa" w:w="80"/>
+              <w:left w:type="dxa" w:w="120"/>
+              <w:bottom w:type="dxa" w:w="80"/>
+              <w:right w:type="dxa" w:w="120"/>
+            </w:tcMar>
+          </w:tcPr>
+          <w:p>
+            <w:r>
+              <w:rPr>
+                <w:b w:val="false"/>
+                <w:bCs w:val="false"/>
+                <w:sz w:val="18"/>
+                <w:szCs w:val="18"/>
+              </w:rPr>
+              <w:t xml:space="preserve">Resolvido</w:t>
             </w:r>
           </w:p>
         </w:tc>
@@ -642,57 +656,179 @@
         </w:trPr>
         <w:tc>
           <w:tcPr>
-            <w:tcW w:type="dxa" w:w="4500"/>
-            <w:tcBorders>
-              <w:top w:val="single" w:color="BFBFBF" w:sz="4"/>
-              <w:left w:val="single" w:color="BFBFBF" w:sz="4"/>
-              <w:bottom w:val="single" w:color="BFBFBF" w:sz="4"/>
-              <w:right w:val="single" w:color="BFBFBF" w:sz="4"/>
-            </w:tcBorders>
-            <w:tcMar>
-              <w:top w:type="dxa" w:w="80"/>
-              <w:left w:type="dxa" w:w="120"/>
-              <w:bottom w:type="dxa" w:w="80"/>
-              <w:right w:type="dxa" w:w="120"/>
-            </w:tcMar>
-          </w:tcPr>
-          <w:p>
-            <w:r>
-              <w:rPr>
-                <w:b w:val="false"/>
-                <w:bCs w:val="false"/>
-                <w:sz w:val="18"/>
-                <w:szCs w:val="18"/>
-              </w:rPr>
-              <w:t xml:space="preserve">Devedores não-listados (CVM não cobre)</w:t>
-            </w:r>
-          </w:p>
-        </w:tc>
-        <w:tc>
-          <w:tcPr>
-            <w:tcW w:type="dxa" w:w="4860"/>
-            <w:tcBorders>
-              <w:top w:val="single" w:color="BFBFBF" w:sz="4"/>
-              <w:left w:val="single" w:color="BFBFBF" w:sz="4"/>
-              <w:bottom w:val="single" w:color="BFBFBF" w:sz="4"/>
-              <w:right w:val="single" w:color="BFBFBF" w:sz="4"/>
-            </w:tcBorders>
-            <w:tcMar>
-              <w:top w:type="dxa" w:w="80"/>
-              <w:left w:type="dxa" w:w="120"/>
-              <w:bottom w:type="dxa" w:w="80"/>
-              <w:right w:type="dxa" w:w="120"/>
-            </w:tcMar>
-          </w:tcPr>
-          <w:p>
-            <w:r>
-              <w:rPr>
-                <w:b w:val="false"/>
-                <w:bCs w:val="false"/>
-                <w:sz w:val="18"/>
-                <w:szCs w:val="18"/>
-              </w:rPr>
-              <w:t xml:space="preserve">Fase 2 — pendente</w:t>
+            <w:tcW w:type="dxa" w:w="5500"/>
+            <w:tcBorders>
+              <w:top w:val="single" w:color="BFBFBF" w:sz="4"/>
+              <w:left w:val="single" w:color="BFBFBF" w:sz="4"/>
+              <w:bottom w:val="single" w:color="BFBFBF" w:sz="4"/>
+              <w:right w:val="single" w:color="BFBFBF" w:sz="4"/>
+            </w:tcBorders>
+            <w:tcMar>
+              <w:top w:type="dxa" w:w="80"/>
+              <w:left w:type="dxa" w:w="120"/>
+              <w:bottom w:type="dxa" w:w="80"/>
+              <w:right w:type="dxa" w:w="120"/>
+            </w:tcMar>
+          </w:tcPr>
+          <w:p>
+            <w:r>
+              <w:rPr>
+                <w:b w:val="false"/>
+                <w:bCs w:val="false"/>
+                <w:sz w:val="18"/>
+                <w:szCs w:val="18"/>
+              </w:rPr>
+              <w:t xml:space="preserve">Procedimento de regeneração do token ClickUp</w:t>
+            </w:r>
+          </w:p>
+        </w:tc>
+        <w:tc>
+          <w:tcPr>
+            <w:tcW w:type="dxa" w:w="3860"/>
+            <w:tcBorders>
+              <w:top w:val="single" w:color="BFBFBF" w:sz="4"/>
+              <w:left w:val="single" w:color="BFBFBF" w:sz="4"/>
+              <w:bottom w:val="single" w:color="BFBFBF" w:sz="4"/>
+              <w:right w:val="single" w:color="BFBFBF" w:sz="4"/>
+            </w:tcBorders>
+            <w:tcMar>
+              <w:top w:type="dxa" w:w="80"/>
+              <w:left w:type="dxa" w:w="120"/>
+              <w:bottom w:type="dxa" w:w="80"/>
+              <w:right w:type="dxa" w:w="120"/>
+            </w:tcMar>
+          </w:tcPr>
+          <w:p>
+            <w:r>
+              <w:rPr>
+                <w:b w:val="false"/>
+                <w:bCs w:val="false"/>
+                <w:sz w:val="18"/>
+                <w:szCs w:val="18"/>
+              </w:rPr>
+              <w:t xml:space="preserve">Documentado e versionado</w:t>
+            </w:r>
+          </w:p>
+        </w:tc>
+      </w:tr>
+      <w:tr>
+        <w:trPr>
+          <w:tblHeader w:val="false"/>
+        </w:trPr>
+        <w:tc>
+          <w:tcPr>
+            <w:tcW w:type="dxa" w:w="5500"/>
+            <w:tcBorders>
+              <w:top w:val="single" w:color="BFBFBF" w:sz="4"/>
+              <w:left w:val="single" w:color="BFBFBF" w:sz="4"/>
+              <w:bottom w:val="single" w:color="BFBFBF" w:sz="4"/>
+              <w:right w:val="single" w:color="BFBFBF" w:sz="4"/>
+            </w:tcBorders>
+            <w:tcMar>
+              <w:top w:type="dxa" w:w="80"/>
+              <w:left w:type="dxa" w:w="120"/>
+              <w:bottom w:type="dxa" w:w="80"/>
+              <w:right w:type="dxa" w:w="120"/>
+            </w:tcMar>
+          </w:tcPr>
+          <w:p>
+            <w:r>
+              <w:rPr>
+                <w:b w:val="false"/>
+                <w:bCs w:val="false"/>
+                <w:sz w:val="18"/>
+                <w:szCs w:val="18"/>
+              </w:rPr>
+              <w:t xml:space="preserve">Documentação institucional (manual, plano, comunicação)</w:t>
+            </w:r>
+          </w:p>
+        </w:tc>
+        <w:tc>
+          <w:tcPr>
+            <w:tcW w:type="dxa" w:w="3860"/>
+            <w:tcBorders>
+              <w:top w:val="single" w:color="BFBFBF" w:sz="4"/>
+              <w:left w:val="single" w:color="BFBFBF" w:sz="4"/>
+              <w:bottom w:val="single" w:color="BFBFBF" w:sz="4"/>
+              <w:right w:val="single" w:color="BFBFBF" w:sz="4"/>
+            </w:tcBorders>
+            <w:tcMar>
+              <w:top w:type="dxa" w:w="80"/>
+              <w:left w:type="dxa" w:w="120"/>
+              <w:bottom w:type="dxa" w:w="80"/>
+              <w:right w:type="dxa" w:w="120"/>
+            </w:tcMar>
+          </w:tcPr>
+          <w:p>
+            <w:r>
+              <w:rPr>
+                <w:b w:val="false"/>
+                <w:bCs w:val="false"/>
+                <w:sz w:val="18"/>
+                <w:szCs w:val="18"/>
+              </w:rPr>
+              <w:t xml:space="preserve">Versionada no GitHub</w:t>
+            </w:r>
+          </w:p>
+        </w:tc>
+      </w:tr>
+      <w:tr>
+        <w:trPr>
+          <w:tblHeader w:val="false"/>
+        </w:trPr>
+        <w:tc>
+          <w:tcPr>
+            <w:tcW w:type="dxa" w:w="5500"/>
+            <w:tcBorders>
+              <w:top w:val="single" w:color="BFBFBF" w:sz="4"/>
+              <w:left w:val="single" w:color="BFBFBF" w:sz="4"/>
+              <w:bottom w:val="single" w:color="BFBFBF" w:sz="4"/>
+              <w:right w:val="single" w:color="BFBFBF" w:sz="4"/>
+            </w:tcBorders>
+            <w:tcMar>
+              <w:top w:type="dxa" w:w="80"/>
+              <w:left w:type="dxa" w:w="120"/>
+              <w:bottom w:type="dxa" w:w="80"/>
+              <w:right w:type="dxa" w:w="120"/>
+            </w:tcMar>
+          </w:tcPr>
+          <w:p>
+            <w:r>
+              <w:rPr>
+                <w:b w:val="false"/>
+                <w:bCs w:val="false"/>
+                <w:sz w:val="18"/>
+                <w:szCs w:val="18"/>
+              </w:rPr>
+              <w:t xml:space="preserve">Cobertura de devedores não listados</w:t>
+            </w:r>
+          </w:p>
+        </w:tc>
+        <w:tc>
+          <w:tcPr>
+            <w:tcW w:type="dxa" w:w="3860"/>
+            <w:tcBorders>
+              <w:top w:val="single" w:color="BFBFBF" w:sz="4"/>
+              <w:left w:val="single" w:color="BFBFBF" w:sz="4"/>
+              <w:bottom w:val="single" w:color="BFBFBF" w:sz="4"/>
+              <w:right w:val="single" w:color="BFBFBF" w:sz="4"/>
+            </w:tcBorders>
+            <w:tcMar>
+              <w:top w:type="dxa" w:w="80"/>
+              <w:left w:type="dxa" w:w="120"/>
+              <w:bottom w:type="dxa" w:w="80"/>
+              <w:right w:type="dxa" w:w="120"/>
+            </w:tcMar>
+          </w:tcPr>
+          <w:p>
+            <w:r>
+              <w:rPr>
+                <w:b w:val="false"/>
+                <w:bCs w:val="false"/>
+                <w:sz w:val="18"/>
+                <w:szCs w:val="18"/>
+              </w:rPr>
+              <w:t xml:space="preserve">Pendente (Fase 2A)</w:t>
             </w:r>
           </w:p>
         </w:tc>
@@ -735,7 +871,7 @@
         <w:spacing w:after="120"/>
       </w:pPr>
       <w:r>
-        <w:t xml:space="preserve">A Marvin atua como Agente de Garantias de grandes credores (mercantis e financeiros), gerindo colaterais financeiros — recebíveis de cartão, cash-in-transit, duplicatas, contratos comerciais — como garantia de exposições que, em geral, ultrapassam R$ 15 milhões por devedor.</w:t>
+        <w:t xml:space="preserve">A Marvin atua como Agente de Garantias de grandes credores, gerindo colaterais financeiros (recebíveis de cartão, cash-in-transit, duplicatas, contratos comerciais) como garantia de exposições que, em geral, ultrapassam R$ 15 milhões por devedor.</w:t>
       </w:r>
     </w:p>
     <w:p>
@@ -743,7 +879,7 @@
         <w:spacing w:after="120"/>
       </w:pPr>
       <w:r>
-        <w:t xml:space="preserve">O sistema interno da Marvin (ICG, agenda performada, gravames de terceiros) detecta deterioração do colateral em tempo real. Mas detecção de deterioração é informação tardia: quando o ICG cai, o problema já existe.</w:t>
+        <w:t xml:space="preserve">O sistema interno da Marvin (ICG, agenda performada, gravames de terceiros) detecta deterioração do colateral em tempo real. Eventos adversos externos, no entanto, como troca abrupta de auditor, renegociação de covenants ou ação judicial relevante, antecedem a deterioração do colateral em semanas ou meses. Capturar esses sinais cedo permite ao time de Risco agir antes — apertar covenants, reter recursos, alertar o credor — em vez de reagir depois.</w:t>
       </w:r>
     </w:p>
     <w:p>
@@ -751,15 +887,7 @@
         <w:spacing w:after="120"/>
       </w:pPr>
       <w:r>
-        <w:t xml:space="preserve">Eventos adversos externos, como troca abrupta de auditor, renegociação de covenants ou ação judicial relevante, antecedem a deterioração do colateral em semanas ou meses. Capturar esses sinais cedo permite ao time de Risco agir antes — apertar covenants, reter recursos, alertar o credor — em vez de reagir depois.</w:t>
-      </w:r>
-    </w:p>
-    <w:p>
-      <w:pPr>
-        <w:spacing w:after="120"/>
-      </w:pPr>
-      <w:r>
-        <w:t xml:space="preserve">Este monitor é o primeiro canal automatizado para essa captura, focado em devedores listados na CVM (que são obrigados por Resolução CVM 44/2021 a divulgar fatos relevantes em até um dia útil).</w:t>
+        <w:t xml:space="preserve">Este monitor é o primeiro canal automatizado para essa captura, focado em devedores listados na CVM, que são obrigados pela Resolução CVM 44/2021 a divulgar fatos relevantes em até um dia útil.</w:t>
       </w:r>
     </w:p>
     <w:p>
@@ -796,7 +924,7 @@
         <w:spacing w:after="80"/>
       </w:pPr>
       <w:r>
-        <w:t xml:space="preserve">Monitoramento de Vencimento de Poderes (ClickUp + Cowork)</w:t>
+        <w:t xml:space="preserve">Monitoramento de Vencimento de Poderes (ClickUp).</w:t>
       </w:r>
     </w:p>
     <w:p>
@@ -809,7 +937,7 @@
         <w:spacing w:after="80"/>
       </w:pPr>
       <w:r>
-        <w:t xml:space="preserve">Monitoramento JUCESP (mudanças cadastrais de Fiduciantes)</w:t>
+        <w:t xml:space="preserve">Monitoramento JUCESP (mudanças cadastrais de Fiduciantes).</w:t>
       </w:r>
     </w:p>
     <w:p>
@@ -822,7 +950,7 @@
         <w:spacing w:after="80"/>
       </w:pPr>
       <w:r>
-        <w:t xml:space="preserve">Monitoramento de Ratings de Crédito (GitHub Actions + ClickUp)</w:t>
+        <w:t xml:space="preserve">Monitoramento de Ratings de Crédito (GitHub Actions + ClickUp).</w:t>
       </w:r>
     </w:p>
     <w:p>
@@ -835,7 +963,7 @@
         <w:spacing w:after="80"/>
       </w:pPr>
       <w:r>
-        <w:t xml:space="preserve">Monitoramento de Fatos Relevantes CVM (este)</w:t>
+        <w:t xml:space="preserve">Monitoramento de Fatos Relevantes CVM (este documento).</w:t>
       </w:r>
     </w:p>
     <w:p>
@@ -883,8 +1011,8 @@
         </w:tblBorders>
       </w:tblPr>
       <w:tblGrid>
-        <w:gridCol w:w="3500"/>
-        <w:gridCol w:w="5860"/>
+        <w:gridCol w:w="4000"/>
+        <w:gridCol w:w="5360"/>
       </w:tblGrid>
       <w:tr>
         <w:trPr>
@@ -892,7 +1020,7 @@
         </w:trPr>
         <w:tc>
           <w:tcPr>
-            <w:tcW w:type="dxa" w:w="3500"/>
+            <w:tcW w:type="dxa" w:w="4000"/>
             <w:tcBorders>
               <w:top w:val="single" w:color="BFBFBF" w:sz="4"/>
               <w:left w:val="single" w:color="BFBFBF" w:sz="4"/>
@@ -922,7 +1050,7 @@
         </w:tc>
         <w:tc>
           <w:tcPr>
-            <w:tcW w:type="dxa" w:w="5860"/>
+            <w:tcW w:type="dxa" w:w="5360"/>
             <w:tcBorders>
               <w:top w:val="single" w:color="BFBFBF" w:sz="4"/>
               <w:left w:val="single" w:color="BFBFBF" w:sz="4"/>
@@ -957,57 +1085,57 @@
         </w:trPr>
         <w:tc>
           <w:tcPr>
-            <w:tcW w:type="dxa" w:w="3500"/>
-            <w:tcBorders>
-              <w:top w:val="single" w:color="BFBFBF" w:sz="4"/>
-              <w:left w:val="single" w:color="BFBFBF" w:sz="4"/>
-              <w:bottom w:val="single" w:color="BFBFBF" w:sz="4"/>
-              <w:right w:val="single" w:color="BFBFBF" w:sz="4"/>
-            </w:tcBorders>
-            <w:tcMar>
-              <w:top w:type="dxa" w:w="80"/>
-              <w:left w:type="dxa" w:w="120"/>
-              <w:bottom w:type="dxa" w:w="80"/>
-              <w:right w:type="dxa" w:w="120"/>
-            </w:tcMar>
-          </w:tcPr>
-          <w:p>
-            <w:r>
-              <w:rPr>
-                <w:b w:val="false"/>
-                <w:bCs w:val="false"/>
-                <w:sz w:val="18"/>
-                <w:szCs w:val="18"/>
-              </w:rPr>
-              <w:t xml:space="preserve">monitor.py</w:t>
-            </w:r>
-          </w:p>
-        </w:tc>
-        <w:tc>
-          <w:tcPr>
-            <w:tcW w:type="dxa" w:w="5860"/>
-            <w:tcBorders>
-              <w:top w:val="single" w:color="BFBFBF" w:sz="4"/>
-              <w:left w:val="single" w:color="BFBFBF" w:sz="4"/>
-              <w:bottom w:val="single" w:color="BFBFBF" w:sz="4"/>
-              <w:right w:val="single" w:color="BFBFBF" w:sz="4"/>
-            </w:tcBorders>
-            <w:tcMar>
-              <w:top w:type="dxa" w:w="80"/>
-              <w:left w:type="dxa" w:w="120"/>
-              <w:bottom w:type="dxa" w:w="80"/>
-              <w:right w:type="dxa" w:w="120"/>
-            </w:tcMar>
-          </w:tcPr>
-          <w:p>
-            <w:r>
-              <w:rPr>
-                <w:b w:val="false"/>
-                <w:bCs w:val="false"/>
-                <w:sz w:val="18"/>
-                <w:szCs w:val="18"/>
-              </w:rPr>
-              <w:t xml:space="preserve">Script principal Python — orquestra coleta, filtragem, classificação, persistência e envio de e-mail</w:t>
+            <w:tcW w:type="dxa" w:w="4000"/>
+            <w:tcBorders>
+              <w:top w:val="single" w:color="BFBFBF" w:sz="4"/>
+              <w:left w:val="single" w:color="BFBFBF" w:sz="4"/>
+              <w:bottom w:val="single" w:color="BFBFBF" w:sz="4"/>
+              <w:right w:val="single" w:color="BFBFBF" w:sz="4"/>
+            </w:tcBorders>
+            <w:tcMar>
+              <w:top w:type="dxa" w:w="80"/>
+              <w:left w:type="dxa" w:w="120"/>
+              <w:bottom w:type="dxa" w:w="80"/>
+              <w:right w:type="dxa" w:w="120"/>
+            </w:tcMar>
+          </w:tcPr>
+          <w:p>
+            <w:r>
+              <w:rPr>
+                <w:b w:val="false"/>
+                <w:bCs w:val="false"/>
+                <w:sz w:val="18"/>
+                <w:szCs w:val="18"/>
+              </w:rPr>
+              <w:t xml:space="preserve">monitor.py (local)</w:t>
+            </w:r>
+          </w:p>
+        </w:tc>
+        <w:tc>
+          <w:tcPr>
+            <w:tcW w:type="dxa" w:w="5360"/>
+            <w:tcBorders>
+              <w:top w:val="single" w:color="BFBFBF" w:sz="4"/>
+              <w:left w:val="single" w:color="BFBFBF" w:sz="4"/>
+              <w:bottom w:val="single" w:color="BFBFBF" w:sz="4"/>
+              <w:right w:val="single" w:color="BFBFBF" w:sz="4"/>
+            </w:tcBorders>
+            <w:tcMar>
+              <w:top w:type="dxa" w:w="80"/>
+              <w:left w:type="dxa" w:w="120"/>
+              <w:bottom w:type="dxa" w:w="80"/>
+              <w:right w:type="dxa" w:w="120"/>
+            </w:tcMar>
+          </w:tcPr>
+          <w:p>
+            <w:r>
+              <w:rPr>
+                <w:b w:val="false"/>
+                <w:bCs w:val="false"/>
+                <w:sz w:val="18"/>
+                <w:szCs w:val="18"/>
+              </w:rPr>
+              <w:t xml:space="preserve">Roda no PC da responsável a cada login. Coleta, filtra, persiste, envia e-mail.</w:t>
             </w:r>
           </w:p>
         </w:tc>
@@ -1018,57 +1146,57 @@
         </w:trPr>
         <w:tc>
           <w:tcPr>
-            <w:tcW w:type="dxa" w:w="3500"/>
-            <w:tcBorders>
-              <w:top w:val="single" w:color="BFBFBF" w:sz="4"/>
-              <w:left w:val="single" w:color="BFBFBF" w:sz="4"/>
-              <w:bottom w:val="single" w:color="BFBFBF" w:sz="4"/>
-              <w:right w:val="single" w:color="BFBFBF" w:sz="4"/>
-            </w:tcBorders>
-            <w:tcMar>
-              <w:top w:type="dxa" w:w="80"/>
-              <w:left w:type="dxa" w:w="120"/>
-              <w:bottom w:type="dxa" w:w="80"/>
-              <w:right w:type="dxa" w:w="120"/>
-            </w:tcMar>
-          </w:tcPr>
-          <w:p>
-            <w:r>
-              <w:rPr>
-                <w:b w:val="false"/>
-                <w:bCs w:val="false"/>
-                <w:sz w:val="18"/>
-                <w:szCs w:val="18"/>
-              </w:rPr>
-              <w:t xml:space="preserve">watchlist.csv</w:t>
-            </w:r>
-          </w:p>
-        </w:tc>
-        <w:tc>
-          <w:tcPr>
-            <w:tcW w:type="dxa" w:w="5860"/>
-            <w:tcBorders>
-              <w:top w:val="single" w:color="BFBFBF" w:sz="4"/>
-              <w:left w:val="single" w:color="BFBFBF" w:sz="4"/>
-              <w:bottom w:val="single" w:color="BFBFBF" w:sz="4"/>
-              <w:right w:val="single" w:color="BFBFBF" w:sz="4"/>
-            </w:tcBorders>
-            <w:tcMar>
-              <w:top w:type="dxa" w:w="80"/>
-              <w:left w:type="dxa" w:w="120"/>
-              <w:bottom w:type="dxa" w:w="80"/>
-              <w:right w:type="dxa" w:w="120"/>
-            </w:tcMar>
-          </w:tcPr>
-          <w:p>
-            <w:r>
-              <w:rPr>
-                <w:b w:val="false"/>
-                <w:bCs w:val="false"/>
-                <w:sz w:val="18"/>
-                <w:szCs w:val="18"/>
-              </w:rPr>
-              <w:t xml:space="preserve">Lista dos 20 devedores monitorados, com CNPJ, razão social e credor principal</w:t>
+            <w:tcW w:type="dxa" w:w="4000"/>
+            <w:tcBorders>
+              <w:top w:val="single" w:color="BFBFBF" w:sz="4"/>
+              <w:left w:val="single" w:color="BFBFBF" w:sz="4"/>
+              <w:bottom w:val="single" w:color="BFBFBF" w:sz="4"/>
+              <w:right w:val="single" w:color="BFBFBF" w:sz="4"/>
+            </w:tcBorders>
+            <w:tcMar>
+              <w:top w:type="dxa" w:w="80"/>
+              <w:left w:type="dxa" w:w="120"/>
+              <w:bottom w:type="dxa" w:w="80"/>
+              <w:right w:type="dxa" w:w="120"/>
+            </w:tcMar>
+          </w:tcPr>
+          <w:p>
+            <w:r>
+              <w:rPr>
+                <w:b w:val="false"/>
+                <w:bCs w:val="false"/>
+                <w:sz w:val="18"/>
+                <w:szCs w:val="18"/>
+              </w:rPr>
+              <w:t xml:space="preserve">monitor.py (cloud)</w:t>
+            </w:r>
+          </w:p>
+        </w:tc>
+        <w:tc>
+          <w:tcPr>
+            <w:tcW w:type="dxa" w:w="5360"/>
+            <w:tcBorders>
+              <w:top w:val="single" w:color="BFBFBF" w:sz="4"/>
+              <w:left w:val="single" w:color="BFBFBF" w:sz="4"/>
+              <w:bottom w:val="single" w:color="BFBFBF" w:sz="4"/>
+              <w:right w:val="single" w:color="BFBFBF" w:sz="4"/>
+            </w:tcBorders>
+            <w:tcMar>
+              <w:top w:type="dxa" w:w="80"/>
+              <w:left w:type="dxa" w:w="120"/>
+              <w:bottom w:type="dxa" w:w="80"/>
+              <w:right w:type="dxa" w:w="120"/>
+            </w:tcMar>
+          </w:tcPr>
+          <w:p>
+            <w:r>
+              <w:rPr>
+                <w:b w:val="false"/>
+                <w:bCs w:val="false"/>
+                <w:sz w:val="18"/>
+                <w:szCs w:val="18"/>
+              </w:rPr>
+              <w:t xml:space="preserve">Roda no GitHub Actions diariamente às 10h BRT. Mesma lógica, notifica via ClickUp.</w:t>
             </w:r>
           </w:p>
         </w:tc>
@@ -1079,57 +1207,57 @@
         </w:trPr>
         <w:tc>
           <w:tcPr>
-            <w:tcW w:type="dxa" w:w="3500"/>
-            <w:tcBorders>
-              <w:top w:val="single" w:color="BFBFBF" w:sz="4"/>
-              <w:left w:val="single" w:color="BFBFBF" w:sz="4"/>
-              <w:bottom w:val="single" w:color="BFBFBF" w:sz="4"/>
-              <w:right w:val="single" w:color="BFBFBF" w:sz="4"/>
-            </w:tcBorders>
-            <w:tcMar>
-              <w:top w:type="dxa" w:w="80"/>
-              <w:left w:type="dxa" w:w="120"/>
-              <w:bottom w:type="dxa" w:w="80"/>
-              <w:right w:type="dxa" w:w="120"/>
-            </w:tcMar>
-          </w:tcPr>
-          <w:p>
-            <w:r>
-              <w:rPr>
-                <w:b w:val="false"/>
-                <w:bCs w:val="false"/>
-                <w:sz w:val="18"/>
-                <w:szCs w:val="18"/>
-              </w:rPr>
-              <w:t xml:space="preserve">historico_eventos.xlsx</w:t>
-            </w:r>
-          </w:p>
-        </w:tc>
-        <w:tc>
-          <w:tcPr>
-            <w:tcW w:type="dxa" w:w="5860"/>
-            <w:tcBorders>
-              <w:top w:val="single" w:color="BFBFBF" w:sz="4"/>
-              <w:left w:val="single" w:color="BFBFBF" w:sz="4"/>
-              <w:bottom w:val="single" w:color="BFBFBF" w:sz="4"/>
-              <w:right w:val="single" w:color="BFBFBF" w:sz="4"/>
-            </w:tcBorders>
-            <w:tcMar>
-              <w:top w:type="dxa" w:w="80"/>
-              <w:left w:type="dxa" w:w="120"/>
-              <w:bottom w:type="dxa" w:w="80"/>
-              <w:right w:type="dxa" w:w="120"/>
-            </w:tcMar>
-          </w:tcPr>
-          <w:p>
-            <w:r>
-              <w:rPr>
-                <w:b w:val="false"/>
-                <w:bCs w:val="false"/>
-                <w:sz w:val="18"/>
-                <w:szCs w:val="18"/>
-              </w:rPr>
-              <w:t xml:space="preserve">Planilha histórica formatada por materialidade — fonte de consulta visual</w:t>
+            <w:tcW w:type="dxa" w:w="4000"/>
+            <w:tcBorders>
+              <w:top w:val="single" w:color="BFBFBF" w:sz="4"/>
+              <w:left w:val="single" w:color="BFBFBF" w:sz="4"/>
+              <w:bottom w:val="single" w:color="BFBFBF" w:sz="4"/>
+              <w:right w:val="single" w:color="BFBFBF" w:sz="4"/>
+            </w:tcBorders>
+            <w:tcMar>
+              <w:top w:type="dxa" w:w="80"/>
+              <w:left w:type="dxa" w:w="120"/>
+              <w:bottom w:type="dxa" w:w="80"/>
+              <w:right w:type="dxa" w:w="120"/>
+            </w:tcMar>
+          </w:tcPr>
+          <w:p>
+            <w:r>
+              <w:rPr>
+                <w:b w:val="false"/>
+                <w:bCs w:val="false"/>
+                <w:sz w:val="18"/>
+                <w:szCs w:val="18"/>
+              </w:rPr>
+              <w:t xml:space="preserve">watchlist.csv</w:t>
+            </w:r>
+          </w:p>
+        </w:tc>
+        <w:tc>
+          <w:tcPr>
+            <w:tcW w:type="dxa" w:w="5360"/>
+            <w:tcBorders>
+              <w:top w:val="single" w:color="BFBFBF" w:sz="4"/>
+              <w:left w:val="single" w:color="BFBFBF" w:sz="4"/>
+              <w:bottom w:val="single" w:color="BFBFBF" w:sz="4"/>
+              <w:right w:val="single" w:color="BFBFBF" w:sz="4"/>
+            </w:tcBorders>
+            <w:tcMar>
+              <w:top w:type="dxa" w:w="80"/>
+              <w:left w:type="dxa" w:w="120"/>
+              <w:bottom w:type="dxa" w:w="80"/>
+              <w:right w:type="dxa" w:w="120"/>
+            </w:tcMar>
+          </w:tcPr>
+          <w:p>
+            <w:r>
+              <w:rPr>
+                <w:b w:val="false"/>
+                <w:bCs w:val="false"/>
+                <w:sz w:val="18"/>
+                <w:szCs w:val="18"/>
+              </w:rPr>
+              <w:t xml:space="preserve">Lista dos 20 devedores monitorados, com CNPJ, razão social e credor principal.</w:t>
             </w:r>
           </w:p>
         </w:tc>
@@ -1140,57 +1268,57 @@
         </w:trPr>
         <w:tc>
           <w:tcPr>
-            <w:tcW w:type="dxa" w:w="3500"/>
-            <w:tcBorders>
-              <w:top w:val="single" w:color="BFBFBF" w:sz="4"/>
-              <w:left w:val="single" w:color="BFBFBF" w:sz="4"/>
-              <w:bottom w:val="single" w:color="BFBFBF" w:sz="4"/>
-              <w:right w:val="single" w:color="BFBFBF" w:sz="4"/>
-            </w:tcBorders>
-            <w:tcMar>
-              <w:top w:type="dxa" w:w="80"/>
-              <w:left w:type="dxa" w:w="120"/>
-              <w:bottom w:type="dxa" w:w="80"/>
-              <w:right w:type="dxa" w:w="120"/>
-            </w:tcMar>
-          </w:tcPr>
-          <w:p>
-            <w:r>
-              <w:rPr>
-                <w:b w:val="false"/>
-                <w:bCs w:val="false"/>
-                <w:sz w:val="18"/>
-                <w:szCs w:val="18"/>
-              </w:rPr>
-              <w:t xml:space="preserve">historico.csv</w:t>
-            </w:r>
-          </w:p>
-        </w:tc>
-        <w:tc>
-          <w:tcPr>
-            <w:tcW w:type="dxa" w:w="5860"/>
-            <w:tcBorders>
-              <w:top w:val="single" w:color="BFBFBF" w:sz="4"/>
-              <w:left w:val="single" w:color="BFBFBF" w:sz="4"/>
-              <w:bottom w:val="single" w:color="BFBFBF" w:sz="4"/>
-              <w:right w:val="single" w:color="BFBFBF" w:sz="4"/>
-            </w:tcBorders>
-            <w:tcMar>
-              <w:top w:type="dxa" w:w="80"/>
-              <w:left w:type="dxa" w:w="120"/>
-              <w:bottom w:type="dxa" w:w="80"/>
-              <w:right w:type="dxa" w:w="120"/>
-            </w:tcMar>
-          </w:tcPr>
-          <w:p>
-            <w:r>
-              <w:rPr>
-                <w:b w:val="false"/>
-                <w:bCs w:val="false"/>
-                <w:sz w:val="18"/>
-                <w:szCs w:val="18"/>
-              </w:rPr>
-              <w:t xml:space="preserve">Fonte-verdade auditável em CSV (append-only, dedup por SHA-256)</w:t>
+            <w:tcW w:type="dxa" w:w="4000"/>
+            <w:tcBorders>
+              <w:top w:val="single" w:color="BFBFBF" w:sz="4"/>
+              <w:left w:val="single" w:color="BFBFBF" w:sz="4"/>
+              <w:bottom w:val="single" w:color="BFBFBF" w:sz="4"/>
+              <w:right w:val="single" w:color="BFBFBF" w:sz="4"/>
+            </w:tcBorders>
+            <w:tcMar>
+              <w:top w:type="dxa" w:w="80"/>
+              <w:left w:type="dxa" w:w="120"/>
+              <w:bottom w:type="dxa" w:w="80"/>
+              <w:right w:type="dxa" w:w="120"/>
+            </w:tcMar>
+          </w:tcPr>
+          <w:p>
+            <w:r>
+              <w:rPr>
+                <w:b w:val="false"/>
+                <w:bCs w:val="false"/>
+                <w:sz w:val="18"/>
+                <w:szCs w:val="18"/>
+              </w:rPr>
+              <w:t xml:space="preserve">02. Histórico/</w:t>
+            </w:r>
+          </w:p>
+        </w:tc>
+        <w:tc>
+          <w:tcPr>
+            <w:tcW w:type="dxa" w:w="5360"/>
+            <w:tcBorders>
+              <w:top w:val="single" w:color="BFBFBF" w:sz="4"/>
+              <w:left w:val="single" w:color="BFBFBF" w:sz="4"/>
+              <w:bottom w:val="single" w:color="BFBFBF" w:sz="4"/>
+              <w:right w:val="single" w:color="BFBFBF" w:sz="4"/>
+            </w:tcBorders>
+            <w:tcMar>
+              <w:top w:type="dxa" w:w="80"/>
+              <w:left w:type="dxa" w:w="120"/>
+              <w:bottom w:type="dxa" w:w="80"/>
+              <w:right w:type="dxa" w:w="120"/>
+            </w:tcMar>
+          </w:tcPr>
+          <w:p>
+            <w:r>
+              <w:rPr>
+                <w:b w:val="false"/>
+                <w:bCs w:val="false"/>
+                <w:sz w:val="18"/>
+                <w:szCs w:val="18"/>
+              </w:rPr>
+              <w:t xml:space="preserve">Pasta com a planilha histórica formatada (.xlsx) + CSV auditável.</w:t>
             </w:r>
           </w:p>
         </w:tc>
@@ -1201,57 +1329,57 @@
         </w:trPr>
         <w:tc>
           <w:tcPr>
-            <w:tcW w:type="dxa" w:w="3500"/>
-            <w:tcBorders>
-              <w:top w:val="single" w:color="BFBFBF" w:sz="4"/>
-              <w:left w:val="single" w:color="BFBFBF" w:sz="4"/>
-              <w:bottom w:val="single" w:color="BFBFBF" w:sz="4"/>
-              <w:right w:val="single" w:color="BFBFBF" w:sz="4"/>
-            </w:tcBorders>
-            <w:tcMar>
-              <w:top w:type="dxa" w:w="80"/>
-              <w:left w:type="dxa" w:w="120"/>
-              <w:bottom w:type="dxa" w:w="80"/>
-              <w:right w:type="dxa" w:w="120"/>
-            </w:tcMar>
-          </w:tcPr>
-          <w:p>
-            <w:r>
-              <w:rPr>
-                <w:b w:val="false"/>
-                <w:bCs w:val="false"/>
-                <w:sz w:val="18"/>
-                <w:szCs w:val="18"/>
-              </w:rPr>
-              <w:t xml:space="preserve">E-mail diário via Outlook</w:t>
-            </w:r>
-          </w:p>
-        </w:tc>
-        <w:tc>
-          <w:tcPr>
-            <w:tcW w:type="dxa" w:w="5860"/>
-            <w:tcBorders>
-              <w:top w:val="single" w:color="BFBFBF" w:sz="4"/>
-              <w:left w:val="single" w:color="BFBFBF" w:sz="4"/>
-              <w:bottom w:val="single" w:color="BFBFBF" w:sz="4"/>
-              <w:right w:val="single" w:color="BFBFBF" w:sz="4"/>
-            </w:tcBorders>
-            <w:tcMar>
-              <w:top w:type="dxa" w:w="80"/>
-              <w:left w:type="dxa" w:w="120"/>
-              <w:bottom w:type="dxa" w:w="80"/>
-              <w:right w:type="dxa" w:w="120"/>
-            </w:tcMar>
-          </w:tcPr>
-          <w:p>
-            <w:r>
-              <w:rPr>
-                <w:b w:val="false"/>
-                <w:bCs w:val="false"/>
-                <w:sz w:val="18"/>
-                <w:szCs w:val="18"/>
-              </w:rPr>
-              <w:t xml:space="preserve">Resumo enviado todo dia para a responsável; assunto verde se nada novo, vermelho se há eventos</w:t>
+            <w:tcW w:type="dxa" w:w="4000"/>
+            <w:tcBorders>
+              <w:top w:val="single" w:color="BFBFBF" w:sz="4"/>
+              <w:left w:val="single" w:color="BFBFBF" w:sz="4"/>
+              <w:bottom w:val="single" w:color="BFBFBF" w:sz="4"/>
+              <w:right w:val="single" w:color="BFBFBF" w:sz="4"/>
+            </w:tcBorders>
+            <w:tcMar>
+              <w:top w:type="dxa" w:w="80"/>
+              <w:left w:type="dxa" w:w="120"/>
+              <w:bottom w:type="dxa" w:w="80"/>
+              <w:right w:type="dxa" w:w="120"/>
+            </w:tcMar>
+          </w:tcPr>
+          <w:p>
+            <w:r>
+              <w:rPr>
+                <w:b w:val="false"/>
+                <w:bCs w:val="false"/>
+                <w:sz w:val="18"/>
+                <w:szCs w:val="18"/>
+              </w:rPr>
+              <w:t xml:space="preserve">docs/</w:t>
+            </w:r>
+          </w:p>
+        </w:tc>
+        <w:tc>
+          <w:tcPr>
+            <w:tcW w:type="dxa" w:w="5360"/>
+            <w:tcBorders>
+              <w:top w:val="single" w:color="BFBFBF" w:sz="4"/>
+              <w:left w:val="single" w:color="BFBFBF" w:sz="4"/>
+              <w:bottom w:val="single" w:color="BFBFBF" w:sz="4"/>
+              <w:right w:val="single" w:color="BFBFBF" w:sz="4"/>
+            </w:tcBorders>
+            <w:tcMar>
+              <w:top w:type="dxa" w:w="80"/>
+              <w:left w:type="dxa" w:w="120"/>
+              <w:bottom w:type="dxa" w:w="80"/>
+              <w:right w:type="dxa" w:w="120"/>
+            </w:tcMar>
+          </w:tcPr>
+          <w:p>
+            <w:r>
+              <w:rPr>
+                <w:b w:val="false"/>
+                <w:bCs w:val="false"/>
+                <w:sz w:val="18"/>
+                <w:szCs w:val="18"/>
+              </w:rPr>
+              <w:t xml:space="preserve">Documentação institucional versionada no GitHub: manual PDF, este relatório, working plan, comunicação interna.</w:t>
             </w:r>
           </w:p>
         </w:tc>
@@ -1262,57 +1390,57 @@
         </w:trPr>
         <w:tc>
           <w:tcPr>
-            <w:tcW w:type="dxa" w:w="3500"/>
-            <w:tcBorders>
-              <w:top w:val="single" w:color="BFBFBF" w:sz="4"/>
-              <w:left w:val="single" w:color="BFBFBF" w:sz="4"/>
-              <w:bottom w:val="single" w:color="BFBFBF" w:sz="4"/>
-              <w:right w:val="single" w:color="BFBFBF" w:sz="4"/>
-            </w:tcBorders>
-            <w:tcMar>
-              <w:top w:type="dxa" w:w="80"/>
-              <w:left w:type="dxa" w:w="120"/>
-              <w:bottom w:type="dxa" w:w="80"/>
-              <w:right w:type="dxa" w:w="120"/>
-            </w:tcMar>
-          </w:tcPr>
-          <w:p>
-            <w:r>
-              <w:rPr>
-                <w:b w:val="false"/>
-                <w:bCs w:val="false"/>
-                <w:sz w:val="18"/>
-                <w:szCs w:val="18"/>
-              </w:rPr>
-              <w:t xml:space="preserve">run_weekly.bat</w:t>
-            </w:r>
-          </w:p>
-        </w:tc>
-        <w:tc>
-          <w:tcPr>
-            <w:tcW w:type="dxa" w:w="5860"/>
-            <w:tcBorders>
-              <w:top w:val="single" w:color="BFBFBF" w:sz="4"/>
-              <w:left w:val="single" w:color="BFBFBF" w:sz="4"/>
-              <w:bottom w:val="single" w:color="BFBFBF" w:sz="4"/>
-              <w:right w:val="single" w:color="BFBFBF" w:sz="4"/>
-            </w:tcBorders>
-            <w:tcMar>
-              <w:top w:type="dxa" w:w="80"/>
-              <w:left w:type="dxa" w:w="120"/>
-              <w:bottom w:type="dxa" w:w="80"/>
-              <w:right w:type="dxa" w:w="120"/>
-            </w:tcMar>
-          </w:tcPr>
-          <w:p>
-            <w:r>
-              <w:rPr>
-                <w:b w:val="false"/>
-                <w:bCs w:val="false"/>
-                <w:sz w:val="18"/>
-                <w:szCs w:val="18"/>
-              </w:rPr>
-              <w:t xml:space="preserve">Arquivo chamado pelo Windows para disparar o monitor</w:t>
+            <w:tcW w:type="dxa" w:w="4000"/>
+            <w:tcBorders>
+              <w:top w:val="single" w:color="BFBFBF" w:sz="4"/>
+              <w:left w:val="single" w:color="BFBFBF" w:sz="4"/>
+              <w:bottom w:val="single" w:color="BFBFBF" w:sz="4"/>
+              <w:right w:val="single" w:color="BFBFBF" w:sz="4"/>
+            </w:tcBorders>
+            <w:tcMar>
+              <w:top w:type="dxa" w:w="80"/>
+              <w:left w:type="dxa" w:w="120"/>
+              <w:bottom w:type="dxa" w:w="80"/>
+              <w:right w:type="dxa" w:w="120"/>
+            </w:tcMar>
+          </w:tcPr>
+          <w:p>
+            <w:r>
+              <w:rPr>
+                <w:b w:val="false"/>
+                <w:bCs w:val="false"/>
+                <w:sz w:val="18"/>
+                <w:szCs w:val="18"/>
+              </w:rPr>
+              <w:t xml:space="preserve">PROCEDIMENTO-Regeneracao-Token-ClickUp.md</w:t>
+            </w:r>
+          </w:p>
+        </w:tc>
+        <w:tc>
+          <w:tcPr>
+            <w:tcW w:type="dxa" w:w="5360"/>
+            <w:tcBorders>
+              <w:top w:val="single" w:color="BFBFBF" w:sz="4"/>
+              <w:left w:val="single" w:color="BFBFBF" w:sz="4"/>
+              <w:bottom w:val="single" w:color="BFBFBF" w:sz="4"/>
+              <w:right w:val="single" w:color="BFBFBF" w:sz="4"/>
+            </w:tcBorders>
+            <w:tcMar>
+              <w:top w:type="dxa" w:w="80"/>
+              <w:left w:type="dxa" w:w="120"/>
+              <w:bottom w:type="dxa" w:w="80"/>
+              <w:right w:type="dxa" w:w="120"/>
+            </w:tcMar>
+          </w:tcPr>
+          <w:p>
+            <w:r>
+              <w:rPr>
+                <w:b w:val="false"/>
+                <w:bCs w:val="false"/>
+                <w:sz w:val="18"/>
+                <w:szCs w:val="18"/>
+              </w:rPr>
+              <w:t xml:space="preserve">Procedimento institucional de troca do titular do token, na raiz do repositório.</w:t>
             </w:r>
           </w:p>
         </w:tc>
@@ -1323,118 +1451,57 @@
         </w:trPr>
         <w:tc>
           <w:tcPr>
-            <w:tcW w:type="dxa" w:w="3500"/>
-            <w:tcBorders>
-              <w:top w:val="single" w:color="BFBFBF" w:sz="4"/>
-              <w:left w:val="single" w:color="BFBFBF" w:sz="4"/>
-              <w:bottom w:val="single" w:color="BFBFBF" w:sz="4"/>
-              <w:right w:val="single" w:color="BFBFBF" w:sz="4"/>
-            </w:tcBorders>
-            <w:tcMar>
-              <w:top w:type="dxa" w:w="80"/>
-              <w:left w:type="dxa" w:w="120"/>
-              <w:bottom w:type="dxa" w:w="80"/>
-              <w:right w:type="dxa" w:w="120"/>
-            </w:tcMar>
-          </w:tcPr>
-          <w:p>
-            <w:r>
-              <w:rPr>
-                <w:b w:val="false"/>
-                <w:bCs w:val="false"/>
-                <w:sz w:val="18"/>
-                <w:szCs w:val="18"/>
-              </w:rPr>
-              <w:t xml:space="preserve">Pasta de Inicialização</w:t>
-            </w:r>
-          </w:p>
-        </w:tc>
-        <w:tc>
-          <w:tcPr>
-            <w:tcW w:type="dxa" w:w="5860"/>
-            <w:tcBorders>
-              <w:top w:val="single" w:color="BFBFBF" w:sz="4"/>
-              <w:left w:val="single" w:color="BFBFBF" w:sz="4"/>
-              <w:bottom w:val="single" w:color="BFBFBF" w:sz="4"/>
-              <w:right w:val="single" w:color="BFBFBF" w:sz="4"/>
-            </w:tcBorders>
-            <w:tcMar>
-              <w:top w:type="dxa" w:w="80"/>
-              <w:left w:type="dxa" w:w="120"/>
-              <w:bottom w:type="dxa" w:w="80"/>
-              <w:right w:type="dxa" w:w="120"/>
-            </w:tcMar>
-          </w:tcPr>
-          <w:p>
-            <w:r>
-              <w:rPr>
-                <w:b w:val="false"/>
-                <w:bCs w:val="false"/>
-                <w:sz w:val="18"/>
-                <w:szCs w:val="18"/>
-              </w:rPr>
-              <w:t xml:space="preserve">Atalho que faz o Windows rodar o monitor a cada login da responsável</w:t>
-            </w:r>
-          </w:p>
-        </w:tc>
-      </w:tr>
-      <w:tr>
-        <w:trPr>
-          <w:tblHeader w:val="false"/>
-        </w:trPr>
-        <w:tc>
-          <w:tcPr>
-            <w:tcW w:type="dxa" w:w="3500"/>
-            <w:tcBorders>
-              <w:top w:val="single" w:color="BFBFBF" w:sz="4"/>
-              <w:left w:val="single" w:color="BFBFBF" w:sz="4"/>
-              <w:bottom w:val="single" w:color="BFBFBF" w:sz="4"/>
-              <w:right w:val="single" w:color="BFBFBF" w:sz="4"/>
-            </w:tcBorders>
-            <w:tcMar>
-              <w:top w:type="dxa" w:w="80"/>
-              <w:left w:type="dxa" w:w="120"/>
-              <w:bottom w:type="dxa" w:w="80"/>
-              <w:right w:type="dxa" w:w="120"/>
-            </w:tcMar>
-          </w:tcPr>
-          <w:p>
-            <w:r>
-              <w:rPr>
-                <w:b w:val="false"/>
-                <w:bCs w:val="false"/>
-                <w:sz w:val="18"/>
-                <w:szCs w:val="18"/>
-              </w:rPr>
-              <w:t xml:space="preserve">Manual PDF (padrão Marvin)</w:t>
-            </w:r>
-          </w:p>
-        </w:tc>
-        <w:tc>
-          <w:tcPr>
-            <w:tcW w:type="dxa" w:w="5860"/>
-            <w:tcBorders>
-              <w:top w:val="single" w:color="BFBFBF" w:sz="4"/>
-              <w:left w:val="single" w:color="BFBFBF" w:sz="4"/>
-              <w:bottom w:val="single" w:color="BFBFBF" w:sz="4"/>
-              <w:right w:val="single" w:color="BFBFBF" w:sz="4"/>
-            </w:tcBorders>
-            <w:tcMar>
-              <w:top w:type="dxa" w:w="80"/>
-              <w:left w:type="dxa" w:w="120"/>
-              <w:bottom w:type="dxa" w:w="80"/>
-              <w:right w:type="dxa" w:w="120"/>
-            </w:tcMar>
-          </w:tcPr>
-          <w:p>
-            <w:r>
-              <w:rPr>
-                <w:b w:val="false"/>
-                <w:bCs w:val="false"/>
-                <w:sz w:val="18"/>
-                <w:szCs w:val="18"/>
-              </w:rPr>
-              <w:t xml:space="preserve">Documento técnico de operação, igual aos demais monitoramentos</w:t>
+            <w:tcW w:type="dxa" w:w="4000"/>
+            <w:tcBorders>
+              <w:top w:val="single" w:color="BFBFBF" w:sz="4"/>
+              <w:left w:val="single" w:color="BFBFBF" w:sz="4"/>
+              <w:bottom w:val="single" w:color="BFBFBF" w:sz="4"/>
+              <w:right w:val="single" w:color="BFBFBF" w:sz="4"/>
+            </w:tcBorders>
+            <w:tcMar>
+              <w:top w:type="dxa" w:w="80"/>
+              <w:left w:type="dxa" w:w="120"/>
+              <w:bottom w:type="dxa" w:w="80"/>
+              <w:right w:type="dxa" w:w="120"/>
+            </w:tcMar>
+          </w:tcPr>
+          <w:p>
+            <w:r>
+              <w:rPr>
+                <w:b w:val="false"/>
+                <w:bCs w:val="false"/>
+                <w:sz w:val="18"/>
+                <w:szCs w:val="18"/>
+              </w:rPr>
+              <w:t xml:space="preserve">Pasta de Inicialização (Windows)</w:t>
+            </w:r>
+          </w:p>
+        </w:tc>
+        <w:tc>
+          <w:tcPr>
+            <w:tcW w:type="dxa" w:w="5360"/>
+            <w:tcBorders>
+              <w:top w:val="single" w:color="BFBFBF" w:sz="4"/>
+              <w:left w:val="single" w:color="BFBFBF" w:sz="4"/>
+              <w:bottom w:val="single" w:color="BFBFBF" w:sz="4"/>
+              <w:right w:val="single" w:color="BFBFBF" w:sz="4"/>
+            </w:tcBorders>
+            <w:tcMar>
+              <w:top w:type="dxa" w:w="80"/>
+              <w:left w:type="dxa" w:w="120"/>
+              <w:bottom w:type="dxa" w:w="80"/>
+              <w:right w:type="dxa" w:w="120"/>
+            </w:tcMar>
+          </w:tcPr>
+          <w:p>
+            <w:r>
+              <w:rPr>
+                <w:b w:val="false"/>
+                <w:bCs w:val="false"/>
+                <w:sz w:val="18"/>
+                <w:szCs w:val="18"/>
+              </w:rPr>
+              <w:t xml:space="preserve">Atalho que faz o monitor local rodar a cada login da responsável.</w:t>
             </w:r>
           </w:p>
         </w:tc>
@@ -1453,7 +1520,7 @@
           <w:sz w:val="24"/>
           <w:szCs w:val="24"/>
         </w:rPr>
-        <w:t xml:space="preserve">2.2. Devedores monitorados (watchlist atual)</w:t>
+        <w:t xml:space="preserve">2.2. Devedores monitorados</w:t>
       </w:r>
     </w:p>
     <w:p>
@@ -1461,7 +1528,7 @@
         <w:spacing w:after="120"/>
       </w:pPr>
       <w:r>
-        <w:t xml:space="preserve">Lista atual extraída dos ICFs ativos da Marvin em 24/04/2026:</w:t>
+        <w:t xml:space="preserve">Lista atual da watchlist.csv, baseada nos ICFs ativos da Marvin:</w:t>
       </w:r>
     </w:p>
     <w:tbl>
@@ -1604,7 +1671,7 @@
                 <w:sz w:val="18"/>
                 <w:szCs w:val="18"/>
               </w:rPr>
-              <w:t xml:space="preserve">Grupo CVLB (entidade 1)</w:t>
+              <w:t xml:space="preserve">Grupo CVLB (Casa &amp; Video)</w:t>
             </w:r>
           </w:p>
         </w:tc>
@@ -1660,7 +1727,7 @@
                 <w:sz w:val="18"/>
                 <w:szCs w:val="18"/>
               </w:rPr>
-              <w:t xml:space="preserve">Não</w:t>
+              <w:t xml:space="preserve">Sim</w:t>
             </w:r>
           </w:p>
         </w:tc>
@@ -3405,10 +3472,10 @@
                 <w:bCs/>
                 <w:color w:val="8B6914"/>
               </w:rPr>
-              <w:t xml:space="preserve">ATENÇÃO: </w:t>
-            </w:r>
-            <w:r>
-              <w:t xml:space="preserve">Apenas os 4 devedores marcados como 'Sim' geram eventos neste canal (Casas Bahia, Marisa, Americanas, GPA). Para os privados — Pernambucanas, Fast Shop, Bodytech, Novo Mundo, entre outros — o monitoramento depende de outras fontes (DataJud, DOU, bureaus), previstas como Fase 2.</w:t>
+              <w:t xml:space="preserve">Nota: </w:t>
+            </w:r>
+            <w:r>
+              <w:t xml:space="preserve">Cinco devedores são listados na CVM e portanto cobertos por este canal (Casas Bahia, Marisa, Americanas, GPA e Casa &amp; Video). Os outros 15 são privados e não publicam IPE — o monitoramento desses ficará disponível via DataJud e DOU na Fase 2A.</w:t>
             </w:r>
           </w:p>
         </w:tc>
@@ -3456,7 +3523,7 @@
         <w:spacing w:after="80"/>
       </w:pPr>
       <w:r>
-        <w:t xml:space="preserve">O Windows da responsável é ligado e logado.</w:t>
+        <w:t xml:space="preserve">O GitHub Actions dispara o cron diariamente às 10h BRT (sem dependência de máquina local).</w:t>
       </w:r>
     </w:p>
     <w:p>
@@ -3469,7 +3536,7 @@
         <w:spacing w:after="80"/>
       </w:pPr>
       <w:r>
-        <w:t xml:space="preserve">O atalho na Pasta de Inicialização dispara o run_weekly.bat.</w:t>
+        <w:t xml:space="preserve">Em paralelo, o monitor local roda a cada login do Windows da responsável.</w:t>
       </w:r>
     </w:p>
     <w:p>
@@ -3482,7 +3549,7 @@
         <w:spacing w:after="80"/>
       </w:pPr>
       <w:r>
-        <w:t xml:space="preserve">O .bat chama o Python rodando monitor.py com a flag --lookback 10 (olha 10 dias para trás).</w:t>
+        <w:t xml:space="preserve">Ambos baixam o arquivo IPE anual da CVM em dados.cvm.gov.br (com retry e backoff exponencial).</w:t>
       </w:r>
     </w:p>
     <w:p>
@@ -3495,7 +3562,7 @@
         <w:spacing w:after="80"/>
       </w:pPr>
       <w:r>
-        <w:t xml:space="preserve">O monitor.py baixa o arquivo IPE da CVM em dados.cvm.gov.br (tenta automaticamente .csv e .zip, ano atual e anterior).</w:t>
+        <w:t xml:space="preserve">Filtram pelos CNPJs da watchlist (matching pela raiz de 8 dígitos — captura matriz e filiais).</w:t>
       </w:r>
     </w:p>
     <w:p>
@@ -3508,7 +3575,7 @@
         <w:spacing w:after="80"/>
       </w:pPr>
       <w:r>
-        <w:t xml:space="preserve">Filtra pelos CNPJs da watchlist (matching por raiz de CNPJ — 8 primeiros dígitos — para capturar matriz e filiais).</w:t>
+        <w:t xml:space="preserve">Filtram pelas categorias materiais: Fato Relevante, Comunicado ao Mercado, Aviso aos Acionistas, Assembleia, Calendário de Eventos Corporativos. Base regulatória: Resolução CVM 44/2021.</w:t>
       </w:r>
     </w:p>
     <w:p>
@@ -3521,7 +3588,7 @@
         <w:spacing w:after="80"/>
       </w:pPr>
       <w:r>
-        <w:t xml:space="preserve">Filtra pelas categorias materiais: Fato Relevante, Comunicado ao Mercado, Aviso aos Acionistas, Assembleia, Calendário de Eventos Corporativos.</w:t>
+        <w:t xml:space="preserve">Deduplicam por fingerprint SHA-256 (CNPJ + data + categoria + assunto).</w:t>
       </w:r>
     </w:p>
     <w:p>
@@ -3534,7 +3601,7 @@
         <w:spacing w:after="80"/>
       </w:pPr>
       <w:r>
-        <w:t xml:space="preserve">Classifica cada evento em alta, média ou baixa materialidade. Termos críticos no assunto (covenant, auditor, RJ, penhora, etc.) escalam automaticamente para alta.</w:t>
+        <w:t xml:space="preserve">Persistem em CSV auditável + planilha Excel formatada em 02. Histórico/.</w:t>
       </w:r>
     </w:p>
     <w:p>
@@ -3547,7 +3614,7 @@
         <w:spacing w:after="80"/>
       </w:pPr>
       <w:r>
-        <w:t xml:space="preserve">Deduplica via fingerprint SHA-256 (CNPJ + data + categoria + assunto) — não alerta o mesmo evento duas vezes.</w:t>
+        <w:t xml:space="preserve">Notificam: monitor local envia e-mail via Outlook; monitor cloud cria task no ClickUp na lista Alertas CVM Fatos Relevantes (que dispara e-mail automático aos assignees).</w:t>
       </w:r>
     </w:p>
     <w:p>
@@ -3560,33 +3627,7 @@
         <w:spacing w:after="80"/>
       </w:pPr>
       <w:r>
-        <w:t xml:space="preserve">Persiste em historico.csv (fonte-verdade) e regenera historico_eventos.xlsx com formatação condicional.</w:t>
-      </w:r>
-    </w:p>
-    <w:p>
-      <w:pPr>
-        <w:pStyle w:val="ListParagraph"/>
-        <w:numPr>
-          <w:ilvl w:val="0"/>
-          <w:numId w:val="3"/>
-        </w:numPr>
-        <w:spacing w:after="80"/>
-      </w:pPr>
-      <w:r>
-        <w:t xml:space="preserve">Envia e-mail via Outlook para maria.vitoria@marvin.com.br: assunto verde se nada novo, vermelho com tabela de eventos se houver.</w:t>
-      </w:r>
-    </w:p>
-    <w:p>
-      <w:pPr>
-        <w:pStyle w:val="ListParagraph"/>
-        <w:numPr>
-          <w:ilvl w:val="0"/>
-          <w:numId w:val="3"/>
-        </w:numPr>
-        <w:spacing w:after="80"/>
-      </w:pPr>
-      <w:r>
-        <w:t xml:space="preserve">Grava log da execução em logs/run_AAAAMMDD.log.</w:t>
+        <w:t xml:space="preserve">O monitor cloud commita o estado atualizado de volta no próprio repositório, preservando histórico versionado.</w:t>
       </w:r>
     </w:p>
     <w:p>
@@ -3602,593 +3643,7 @@
           <w:sz w:val="24"/>
           <w:szCs w:val="24"/>
         </w:rPr>
-        <w:t xml:space="preserve">3.2. Componentes técnicos</w:t>
-      </w:r>
-    </w:p>
-    <w:tbl>
-      <w:tblPr>
-        <w:tblW w:type="dxa" w:w="9360"/>
-        <w:tblBorders>
-          <w:top w:val="single" w:color="auto" w:sz="4"/>
-          <w:left w:val="single" w:color="auto" w:sz="4"/>
-          <w:bottom w:val="single" w:color="auto" w:sz="4"/>
-          <w:right w:val="single" w:color="auto" w:sz="4"/>
-          <w:insideH w:val="single" w:color="auto" w:sz="4"/>
-          <w:insideV w:val="single" w:color="auto" w:sz="4"/>
-        </w:tblBorders>
-      </w:tblPr>
-      <w:tblGrid>
-        <w:gridCol w:w="3000"/>
-        <w:gridCol w:w="6360"/>
-      </w:tblGrid>
-      <w:tr>
-        <w:trPr>
-          <w:tblHeader/>
-        </w:trPr>
-        <w:tc>
-          <w:tcPr>
-            <w:tcW w:type="dxa" w:w="3000"/>
-            <w:tcBorders>
-              <w:top w:val="single" w:color="BFBFBF" w:sz="4"/>
-              <w:left w:val="single" w:color="BFBFBF" w:sz="4"/>
-              <w:bottom w:val="single" w:color="BFBFBF" w:sz="4"/>
-              <w:right w:val="single" w:color="BFBFBF" w:sz="4"/>
-            </w:tcBorders>
-            <w:shd w:fill="2E75B6" w:val="clear"/>
-            <w:tcMar>
-              <w:top w:type="dxa" w:w="80"/>
-              <w:left w:type="dxa" w:w="120"/>
-              <w:bottom w:type="dxa" w:w="80"/>
-              <w:right w:type="dxa" w:w="120"/>
-            </w:tcMar>
-          </w:tcPr>
-          <w:p>
-            <w:r>
-              <w:rPr>
-                <w:b/>
-                <w:bCs/>
-                <w:color w:val="FFFFFF"/>
-                <w:sz w:val="18"/>
-                <w:szCs w:val="18"/>
-              </w:rPr>
-              <w:t xml:space="preserve">Camada</w:t>
-            </w:r>
-          </w:p>
-        </w:tc>
-        <w:tc>
-          <w:tcPr>
-            <w:tcW w:type="dxa" w:w="6360"/>
-            <w:tcBorders>
-              <w:top w:val="single" w:color="BFBFBF" w:sz="4"/>
-              <w:left w:val="single" w:color="BFBFBF" w:sz="4"/>
-              <w:bottom w:val="single" w:color="BFBFBF" w:sz="4"/>
-              <w:right w:val="single" w:color="BFBFBF" w:sz="4"/>
-            </w:tcBorders>
-            <w:shd w:fill="2E75B6" w:val="clear"/>
-            <w:tcMar>
-              <w:top w:type="dxa" w:w="80"/>
-              <w:left w:type="dxa" w:w="120"/>
-              <w:bottom w:type="dxa" w:w="80"/>
-              <w:right w:type="dxa" w:w="120"/>
-            </w:tcMar>
-          </w:tcPr>
-          <w:p>
-            <w:r>
-              <w:rPr>
-                <w:b/>
-                <w:bCs/>
-                <w:color w:val="FFFFFF"/>
-                <w:sz w:val="18"/>
-                <w:szCs w:val="18"/>
-              </w:rPr>
-              <w:t xml:space="preserve">Tecnologia / biblioteca</w:t>
-            </w:r>
-          </w:p>
-        </w:tc>
-      </w:tr>
-      <w:tr>
-        <w:trPr>
-          <w:tblHeader w:val="false"/>
-        </w:trPr>
-        <w:tc>
-          <w:tcPr>
-            <w:tcW w:type="dxa" w:w="3000"/>
-            <w:tcBorders>
-              <w:top w:val="single" w:color="BFBFBF" w:sz="4"/>
-              <w:left w:val="single" w:color="BFBFBF" w:sz="4"/>
-              <w:bottom w:val="single" w:color="BFBFBF" w:sz="4"/>
-              <w:right w:val="single" w:color="BFBFBF" w:sz="4"/>
-            </w:tcBorders>
-            <w:tcMar>
-              <w:top w:type="dxa" w:w="80"/>
-              <w:left w:type="dxa" w:w="120"/>
-              <w:bottom w:type="dxa" w:w="80"/>
-              <w:right w:type="dxa" w:w="120"/>
-            </w:tcMar>
-          </w:tcPr>
-          <w:p>
-            <w:r>
-              <w:rPr>
-                <w:b w:val="false"/>
-                <w:bCs w:val="false"/>
-                <w:sz w:val="18"/>
-                <w:szCs w:val="18"/>
-              </w:rPr>
-              <w:t xml:space="preserve">Linguagem</w:t>
-            </w:r>
-          </w:p>
-        </w:tc>
-        <w:tc>
-          <w:tcPr>
-            <w:tcW w:type="dxa" w:w="6360"/>
-            <w:tcBorders>
-              <w:top w:val="single" w:color="BFBFBF" w:sz="4"/>
-              <w:left w:val="single" w:color="BFBFBF" w:sz="4"/>
-              <w:bottom w:val="single" w:color="BFBFBF" w:sz="4"/>
-              <w:right w:val="single" w:color="BFBFBF" w:sz="4"/>
-            </w:tcBorders>
-            <w:tcMar>
-              <w:top w:type="dxa" w:w="80"/>
-              <w:left w:type="dxa" w:w="120"/>
-              <w:bottom w:type="dxa" w:w="80"/>
-              <w:right w:type="dxa" w:w="120"/>
-            </w:tcMar>
-          </w:tcPr>
-          <w:p>
-            <w:r>
-              <w:rPr>
-                <w:b w:val="false"/>
-                <w:bCs w:val="false"/>
-                <w:sz w:val="18"/>
-                <w:szCs w:val="18"/>
-              </w:rPr>
-              <w:t xml:space="preserve">Python 3.10+</w:t>
-            </w:r>
-          </w:p>
-        </w:tc>
-      </w:tr>
-      <w:tr>
-        <w:trPr>
-          <w:tblHeader w:val="false"/>
-        </w:trPr>
-        <w:tc>
-          <w:tcPr>
-            <w:tcW w:type="dxa" w:w="3000"/>
-            <w:tcBorders>
-              <w:top w:val="single" w:color="BFBFBF" w:sz="4"/>
-              <w:left w:val="single" w:color="BFBFBF" w:sz="4"/>
-              <w:bottom w:val="single" w:color="BFBFBF" w:sz="4"/>
-              <w:right w:val="single" w:color="BFBFBF" w:sz="4"/>
-            </w:tcBorders>
-            <w:tcMar>
-              <w:top w:type="dxa" w:w="80"/>
-              <w:left w:type="dxa" w:w="120"/>
-              <w:bottom w:type="dxa" w:w="80"/>
-              <w:right w:type="dxa" w:w="120"/>
-            </w:tcMar>
-          </w:tcPr>
-          <w:p>
-            <w:r>
-              <w:rPr>
-                <w:b w:val="false"/>
-                <w:bCs w:val="false"/>
-                <w:sz w:val="18"/>
-                <w:szCs w:val="18"/>
-              </w:rPr>
-              <w:t xml:space="preserve">Coleta HTTP</w:t>
-            </w:r>
-          </w:p>
-        </w:tc>
-        <w:tc>
-          <w:tcPr>
-            <w:tcW w:type="dxa" w:w="6360"/>
-            <w:tcBorders>
-              <w:top w:val="single" w:color="BFBFBF" w:sz="4"/>
-              <w:left w:val="single" w:color="BFBFBF" w:sz="4"/>
-              <w:bottom w:val="single" w:color="BFBFBF" w:sz="4"/>
-              <w:right w:val="single" w:color="BFBFBF" w:sz="4"/>
-            </w:tcBorders>
-            <w:tcMar>
-              <w:top w:type="dxa" w:w="80"/>
-              <w:left w:type="dxa" w:w="120"/>
-              <w:bottom w:type="dxa" w:w="80"/>
-              <w:right w:type="dxa" w:w="120"/>
-            </w:tcMar>
-          </w:tcPr>
-          <w:p>
-            <w:r>
-              <w:rPr>
-                <w:b w:val="false"/>
-                <w:bCs w:val="false"/>
-                <w:sz w:val="18"/>
-                <w:szCs w:val="18"/>
-              </w:rPr>
-              <w:t xml:space="preserve">requests</w:t>
-            </w:r>
-          </w:p>
-        </w:tc>
-      </w:tr>
-      <w:tr>
-        <w:trPr>
-          <w:tblHeader w:val="false"/>
-        </w:trPr>
-        <w:tc>
-          <w:tcPr>
-            <w:tcW w:type="dxa" w:w="3000"/>
-            <w:tcBorders>
-              <w:top w:val="single" w:color="BFBFBF" w:sz="4"/>
-              <w:left w:val="single" w:color="BFBFBF" w:sz="4"/>
-              <w:bottom w:val="single" w:color="BFBFBF" w:sz="4"/>
-              <w:right w:val="single" w:color="BFBFBF" w:sz="4"/>
-            </w:tcBorders>
-            <w:tcMar>
-              <w:top w:type="dxa" w:w="80"/>
-              <w:left w:type="dxa" w:w="120"/>
-              <w:bottom w:type="dxa" w:w="80"/>
-              <w:right w:type="dxa" w:w="120"/>
-            </w:tcMar>
-          </w:tcPr>
-          <w:p>
-            <w:r>
-              <w:rPr>
-                <w:b w:val="false"/>
-                <w:bCs w:val="false"/>
-                <w:sz w:val="18"/>
-                <w:szCs w:val="18"/>
-              </w:rPr>
-              <w:t xml:space="preserve">Manipulação de dados</w:t>
-            </w:r>
-          </w:p>
-        </w:tc>
-        <w:tc>
-          <w:tcPr>
-            <w:tcW w:type="dxa" w:w="6360"/>
-            <w:tcBorders>
-              <w:top w:val="single" w:color="BFBFBF" w:sz="4"/>
-              <w:left w:val="single" w:color="BFBFBF" w:sz="4"/>
-              <w:bottom w:val="single" w:color="BFBFBF" w:sz="4"/>
-              <w:right w:val="single" w:color="BFBFBF" w:sz="4"/>
-            </w:tcBorders>
-            <w:tcMar>
-              <w:top w:type="dxa" w:w="80"/>
-              <w:left w:type="dxa" w:w="120"/>
-              <w:bottom w:type="dxa" w:w="80"/>
-              <w:right w:type="dxa" w:w="120"/>
-            </w:tcMar>
-          </w:tcPr>
-          <w:p>
-            <w:r>
-              <w:rPr>
-                <w:b w:val="false"/>
-                <w:bCs w:val="false"/>
-                <w:sz w:val="18"/>
-                <w:szCs w:val="18"/>
-              </w:rPr>
-              <w:t xml:space="preserve">pandas</w:t>
-            </w:r>
-          </w:p>
-        </w:tc>
-      </w:tr>
-      <w:tr>
-        <w:trPr>
-          <w:tblHeader w:val="false"/>
-        </w:trPr>
-        <w:tc>
-          <w:tcPr>
-            <w:tcW w:type="dxa" w:w="3000"/>
-            <w:tcBorders>
-              <w:top w:val="single" w:color="BFBFBF" w:sz="4"/>
-              <w:left w:val="single" w:color="BFBFBF" w:sz="4"/>
-              <w:bottom w:val="single" w:color="BFBFBF" w:sz="4"/>
-              <w:right w:val="single" w:color="BFBFBF" w:sz="4"/>
-            </w:tcBorders>
-            <w:tcMar>
-              <w:top w:type="dxa" w:w="80"/>
-              <w:left w:type="dxa" w:w="120"/>
-              <w:bottom w:type="dxa" w:w="80"/>
-              <w:right w:type="dxa" w:w="120"/>
-            </w:tcMar>
-          </w:tcPr>
-          <w:p>
-            <w:r>
-              <w:rPr>
-                <w:b w:val="false"/>
-                <w:bCs w:val="false"/>
-                <w:sz w:val="18"/>
-                <w:szCs w:val="18"/>
-              </w:rPr>
-              <w:t xml:space="preserve">Geração de Excel</w:t>
-            </w:r>
-          </w:p>
-        </w:tc>
-        <w:tc>
-          <w:tcPr>
-            <w:tcW w:type="dxa" w:w="6360"/>
-            <w:tcBorders>
-              <w:top w:val="single" w:color="BFBFBF" w:sz="4"/>
-              <w:left w:val="single" w:color="BFBFBF" w:sz="4"/>
-              <w:bottom w:val="single" w:color="BFBFBF" w:sz="4"/>
-              <w:right w:val="single" w:color="BFBFBF" w:sz="4"/>
-            </w:tcBorders>
-            <w:tcMar>
-              <w:top w:type="dxa" w:w="80"/>
-              <w:left w:type="dxa" w:w="120"/>
-              <w:bottom w:type="dxa" w:w="80"/>
-              <w:right w:type="dxa" w:w="120"/>
-            </w:tcMar>
-          </w:tcPr>
-          <w:p>
-            <w:r>
-              <w:rPr>
-                <w:b w:val="false"/>
-                <w:bCs w:val="false"/>
-                <w:sz w:val="18"/>
-                <w:szCs w:val="18"/>
-              </w:rPr>
-              <w:t xml:space="preserve">openpyxl</w:t>
-            </w:r>
-          </w:p>
-        </w:tc>
-      </w:tr>
-      <w:tr>
-        <w:trPr>
-          <w:tblHeader w:val="false"/>
-        </w:trPr>
-        <w:tc>
-          <w:tcPr>
-            <w:tcW w:type="dxa" w:w="3000"/>
-            <w:tcBorders>
-              <w:top w:val="single" w:color="BFBFBF" w:sz="4"/>
-              <w:left w:val="single" w:color="BFBFBF" w:sz="4"/>
-              <w:bottom w:val="single" w:color="BFBFBF" w:sz="4"/>
-              <w:right w:val="single" w:color="BFBFBF" w:sz="4"/>
-            </w:tcBorders>
-            <w:tcMar>
-              <w:top w:type="dxa" w:w="80"/>
-              <w:left w:type="dxa" w:w="120"/>
-              <w:bottom w:type="dxa" w:w="80"/>
-              <w:right w:type="dxa" w:w="120"/>
-            </w:tcMar>
-          </w:tcPr>
-          <w:p>
-            <w:r>
-              <w:rPr>
-                <w:b w:val="false"/>
-                <w:bCs w:val="false"/>
-                <w:sz w:val="18"/>
-                <w:szCs w:val="18"/>
-              </w:rPr>
-              <w:t xml:space="preserve">Envio de e-mail</w:t>
-            </w:r>
-          </w:p>
-        </w:tc>
-        <w:tc>
-          <w:tcPr>
-            <w:tcW w:type="dxa" w:w="6360"/>
-            <w:tcBorders>
-              <w:top w:val="single" w:color="BFBFBF" w:sz="4"/>
-              <w:left w:val="single" w:color="BFBFBF" w:sz="4"/>
-              <w:bottom w:val="single" w:color="BFBFBF" w:sz="4"/>
-              <w:right w:val="single" w:color="BFBFBF" w:sz="4"/>
-            </w:tcBorders>
-            <w:tcMar>
-              <w:top w:type="dxa" w:w="80"/>
-              <w:left w:type="dxa" w:w="120"/>
-              <w:bottom w:type="dxa" w:w="80"/>
-              <w:right w:type="dxa" w:w="120"/>
-            </w:tcMar>
-          </w:tcPr>
-          <w:p>
-            <w:r>
-              <w:rPr>
-                <w:b w:val="false"/>
-                <w:bCs w:val="false"/>
-                <w:sz w:val="18"/>
-                <w:szCs w:val="18"/>
-              </w:rPr>
-              <w:t xml:space="preserve">pywin32 (Outlook COM Automation)</w:t>
-            </w:r>
-          </w:p>
-        </w:tc>
-      </w:tr>
-      <w:tr>
-        <w:trPr>
-          <w:tblHeader w:val="false"/>
-        </w:trPr>
-        <w:tc>
-          <w:tcPr>
-            <w:tcW w:type="dxa" w:w="3000"/>
-            <w:tcBorders>
-              <w:top w:val="single" w:color="BFBFBF" w:sz="4"/>
-              <w:left w:val="single" w:color="BFBFBF" w:sz="4"/>
-              <w:bottom w:val="single" w:color="BFBFBF" w:sz="4"/>
-              <w:right w:val="single" w:color="BFBFBF" w:sz="4"/>
-            </w:tcBorders>
-            <w:tcMar>
-              <w:top w:type="dxa" w:w="80"/>
-              <w:left w:type="dxa" w:w="120"/>
-              <w:bottom w:type="dxa" w:w="80"/>
-              <w:right w:type="dxa" w:w="120"/>
-            </w:tcMar>
-          </w:tcPr>
-          <w:p>
-            <w:r>
-              <w:rPr>
-                <w:b w:val="false"/>
-                <w:bCs w:val="false"/>
-                <w:sz w:val="18"/>
-                <w:szCs w:val="18"/>
-              </w:rPr>
-              <w:t xml:space="preserve">Agendamento</w:t>
-            </w:r>
-          </w:p>
-        </w:tc>
-        <w:tc>
-          <w:tcPr>
-            <w:tcW w:type="dxa" w:w="6360"/>
-            <w:tcBorders>
-              <w:top w:val="single" w:color="BFBFBF" w:sz="4"/>
-              <w:left w:val="single" w:color="BFBFBF" w:sz="4"/>
-              <w:bottom w:val="single" w:color="BFBFBF" w:sz="4"/>
-              <w:right w:val="single" w:color="BFBFBF" w:sz="4"/>
-            </w:tcBorders>
-            <w:tcMar>
-              <w:top w:type="dxa" w:w="80"/>
-              <w:left w:type="dxa" w:w="120"/>
-              <w:bottom w:type="dxa" w:w="80"/>
-              <w:right w:type="dxa" w:w="120"/>
-            </w:tcMar>
-          </w:tcPr>
-          <w:p>
-            <w:r>
-              <w:rPr>
-                <w:b w:val="false"/>
-                <w:bCs w:val="false"/>
-                <w:sz w:val="18"/>
-                <w:szCs w:val="18"/>
-              </w:rPr>
-              <w:t xml:space="preserve">Pasta de Inicialização do Windows</w:t>
-            </w:r>
-          </w:p>
-        </w:tc>
-      </w:tr>
-      <w:tr>
-        <w:trPr>
-          <w:tblHeader w:val="false"/>
-        </w:trPr>
-        <w:tc>
-          <w:tcPr>
-            <w:tcW w:type="dxa" w:w="3000"/>
-            <w:tcBorders>
-              <w:top w:val="single" w:color="BFBFBF" w:sz="4"/>
-              <w:left w:val="single" w:color="BFBFBF" w:sz="4"/>
-              <w:bottom w:val="single" w:color="BFBFBF" w:sz="4"/>
-              <w:right w:val="single" w:color="BFBFBF" w:sz="4"/>
-            </w:tcBorders>
-            <w:tcMar>
-              <w:top w:type="dxa" w:w="80"/>
-              <w:left w:type="dxa" w:w="120"/>
-              <w:bottom w:type="dxa" w:w="80"/>
-              <w:right w:type="dxa" w:w="120"/>
-            </w:tcMar>
-          </w:tcPr>
-          <w:p>
-            <w:r>
-              <w:rPr>
-                <w:b w:val="false"/>
-                <w:bCs w:val="false"/>
-                <w:sz w:val="18"/>
-                <w:szCs w:val="18"/>
-              </w:rPr>
-              <w:t xml:space="preserve">Fonte de dados</w:t>
-            </w:r>
-          </w:p>
-        </w:tc>
-        <w:tc>
-          <w:tcPr>
-            <w:tcW w:type="dxa" w:w="6360"/>
-            <w:tcBorders>
-              <w:top w:val="single" w:color="BFBFBF" w:sz="4"/>
-              <w:left w:val="single" w:color="BFBFBF" w:sz="4"/>
-              <w:bottom w:val="single" w:color="BFBFBF" w:sz="4"/>
-              <w:right w:val="single" w:color="BFBFBF" w:sz="4"/>
-            </w:tcBorders>
-            <w:tcMar>
-              <w:top w:type="dxa" w:w="80"/>
-              <w:left w:type="dxa" w:w="120"/>
-              <w:bottom w:type="dxa" w:w="80"/>
-              <w:right w:type="dxa" w:w="120"/>
-            </w:tcMar>
-          </w:tcPr>
-          <w:p>
-            <w:r>
-              <w:rPr>
-                <w:b w:val="false"/>
-                <w:bCs w:val="false"/>
-                <w:sz w:val="18"/>
-                <w:szCs w:val="18"/>
-              </w:rPr>
-              <w:t xml:space="preserve">Portal de Dados Abertos da CVM (dados.cvm.gov.br/IPE)</w:t>
-            </w:r>
-          </w:p>
-        </w:tc>
-      </w:tr>
-      <w:tr>
-        <w:trPr>
-          <w:tblHeader w:val="false"/>
-        </w:trPr>
-        <w:tc>
-          <w:tcPr>
-            <w:tcW w:type="dxa" w:w="3000"/>
-            <w:tcBorders>
-              <w:top w:val="single" w:color="BFBFBF" w:sz="4"/>
-              <w:left w:val="single" w:color="BFBFBF" w:sz="4"/>
-              <w:bottom w:val="single" w:color="BFBFBF" w:sz="4"/>
-              <w:right w:val="single" w:color="BFBFBF" w:sz="4"/>
-            </w:tcBorders>
-            <w:tcMar>
-              <w:top w:type="dxa" w:w="80"/>
-              <w:left w:type="dxa" w:w="120"/>
-              <w:bottom w:type="dxa" w:w="80"/>
-              <w:right w:type="dxa" w:w="120"/>
-            </w:tcMar>
-          </w:tcPr>
-          <w:p>
-            <w:r>
-              <w:rPr>
-                <w:b w:val="false"/>
-                <w:bCs w:val="false"/>
-                <w:sz w:val="18"/>
-                <w:szCs w:val="18"/>
-              </w:rPr>
-              <w:t xml:space="preserve">Base regulatória</w:t>
-            </w:r>
-          </w:p>
-        </w:tc>
-        <w:tc>
-          <w:tcPr>
-            <w:tcW w:type="dxa" w:w="6360"/>
-            <w:tcBorders>
-              <w:top w:val="single" w:color="BFBFBF" w:sz="4"/>
-              <w:left w:val="single" w:color="BFBFBF" w:sz="4"/>
-              <w:bottom w:val="single" w:color="BFBFBF" w:sz="4"/>
-              <w:right w:val="single" w:color="BFBFBF" w:sz="4"/>
-            </w:tcBorders>
-            <w:tcMar>
-              <w:top w:type="dxa" w:w="80"/>
-              <w:left w:type="dxa" w:w="120"/>
-              <w:bottom w:type="dxa" w:w="80"/>
-              <w:right w:type="dxa" w:w="120"/>
-            </w:tcMar>
-          </w:tcPr>
-          <w:p>
-            <w:r>
-              <w:rPr>
-                <w:b w:val="false"/>
-                <w:bCs w:val="false"/>
-                <w:sz w:val="18"/>
-                <w:szCs w:val="18"/>
-              </w:rPr>
-              <w:t xml:space="preserve">Resolução CVM 44/2021 — Fato Relevante</w:t>
-            </w:r>
-          </w:p>
-        </w:tc>
-      </w:tr>
-    </w:tbl>
-    <w:p>
-      <w:pPr>
-        <w:pStyle w:val="Heading2"/>
-        <w:spacing w:after="120" w:before="220"/>
-      </w:pPr>
-      <w:r>
-        <w:rPr>
-          <w:b/>
-          <w:bCs/>
-          <w:color w:val="2E75B6"/>
-          <w:sz w:val="24"/>
-          <w:szCs w:val="24"/>
-        </w:rPr>
-        <w:t xml:space="preserve">3.3. Onde os arquivos vivem</w:t>
+        <w:t xml:space="preserve">3.2. Estrutura de pastas atualizada</w:t>
       </w:r>
     </w:p>
     <w:p>
@@ -4196,7 +3651,7 @@
         <w:spacing w:after="120"/>
       </w:pPr>
       <w:r>
-        <w:t xml:space="preserve">Caminho raiz na máquina da responsável:</w:t>
+        <w:t xml:space="preserve">No OneDrive (camada local):</w:t>
       </w:r>
     </w:p>
     <w:p>
@@ -4210,8 +3665,12 @@
           <w:sz w:val="18"/>
           <w:szCs w:val="18"/>
         </w:rPr>
-        <w:t xml:space="preserve">C:\Users\MariaVitoria\OneDrive - Marvin\01. Marvin\Tarefas e Entregas\
-03. Produtizar Contratos ICFs e IAFs\Monitoramento\Monitoramento - Fatos Relevantes\</w:t>
+        <w:t xml:space="preserve">Monitoramento - Fatos Relevantes - Monitor/
+  ├── 00. Relatório de Tarefa MVP/  (Word, PDF — entregáveis institucionais)
+  ├── 01. Manual/                   (markdown — manuais operacionais)
+  ├── 02. Histórico/                (planilha + CSV — fonte-verdade)
+  ├── 03. LOCAL/                    (código do monitor que roda no PC)
+  └── 04. MONITOR/                  (cópia de referência do que está no GitHub)</w:t>
       </w:r>
     </w:p>
     <w:p>
@@ -4219,762 +3678,30 @@
         <w:spacing w:after="120"/>
       </w:pPr>
       <w:r>
-        <w:t xml:space="preserve">Estrutura interna da pasta:</w:t>
-      </w:r>
-    </w:p>
-    <w:tbl>
-      <w:tblPr>
-        <w:tblW w:type="dxa" w:w="9360"/>
-        <w:tblBorders>
-          <w:top w:val="single" w:color="auto" w:sz="4"/>
-          <w:left w:val="single" w:color="auto" w:sz="4"/>
-          <w:bottom w:val="single" w:color="auto" w:sz="4"/>
-          <w:right w:val="single" w:color="auto" w:sz="4"/>
-          <w:insideH w:val="single" w:color="auto" w:sz="4"/>
-          <w:insideV w:val="single" w:color="auto" w:sz="4"/>
-        </w:tblBorders>
-      </w:tblPr>
-      <w:tblGrid>
-        <w:gridCol w:w="3800"/>
-        <w:gridCol w:w="5560"/>
-      </w:tblGrid>
-      <w:tr>
-        <w:trPr>
-          <w:tblHeader/>
-        </w:trPr>
-        <w:tc>
-          <w:tcPr>
-            <w:tcW w:type="dxa" w:w="3800"/>
-            <w:tcBorders>
-              <w:top w:val="single" w:color="BFBFBF" w:sz="4"/>
-              <w:left w:val="single" w:color="BFBFBF" w:sz="4"/>
-              <w:bottom w:val="single" w:color="BFBFBF" w:sz="4"/>
-              <w:right w:val="single" w:color="BFBFBF" w:sz="4"/>
-            </w:tcBorders>
-            <w:shd w:fill="2E75B6" w:val="clear"/>
-            <w:tcMar>
-              <w:top w:type="dxa" w:w="80"/>
-              <w:left w:type="dxa" w:w="120"/>
-              <w:bottom w:type="dxa" w:w="80"/>
-              <w:right w:type="dxa" w:w="120"/>
-            </w:tcMar>
-          </w:tcPr>
-          <w:p>
-            <w:r>
-              <w:rPr>
-                <w:b/>
-                <w:bCs/>
-                <w:color w:val="FFFFFF"/>
-                <w:sz w:val="18"/>
-                <w:szCs w:val="18"/>
-              </w:rPr>
-              <w:t xml:space="preserve">Item</w:t>
-            </w:r>
-          </w:p>
-        </w:tc>
-        <w:tc>
-          <w:tcPr>
-            <w:tcW w:type="dxa" w:w="5560"/>
-            <w:tcBorders>
-              <w:top w:val="single" w:color="BFBFBF" w:sz="4"/>
-              <w:left w:val="single" w:color="BFBFBF" w:sz="4"/>
-              <w:bottom w:val="single" w:color="BFBFBF" w:sz="4"/>
-              <w:right w:val="single" w:color="BFBFBF" w:sz="4"/>
-            </w:tcBorders>
-            <w:shd w:fill="2E75B6" w:val="clear"/>
-            <w:tcMar>
-              <w:top w:type="dxa" w:w="80"/>
-              <w:left w:type="dxa" w:w="120"/>
-              <w:bottom w:type="dxa" w:w="80"/>
-              <w:right w:type="dxa" w:w="120"/>
-            </w:tcMar>
-          </w:tcPr>
-          <w:p>
-            <w:r>
-              <w:rPr>
-                <w:b/>
-                <w:bCs/>
-                <w:color w:val="FFFFFF"/>
-                <w:sz w:val="18"/>
-                <w:szCs w:val="18"/>
-              </w:rPr>
-              <w:t xml:space="preserve">Descrição</w:t>
-            </w:r>
-          </w:p>
-        </w:tc>
-      </w:tr>
-      <w:tr>
-        <w:trPr>
-          <w:tblHeader w:val="false"/>
-        </w:trPr>
-        <w:tc>
-          <w:tcPr>
-            <w:tcW w:type="dxa" w:w="3800"/>
-            <w:tcBorders>
-              <w:top w:val="single" w:color="BFBFBF" w:sz="4"/>
-              <w:left w:val="single" w:color="BFBFBF" w:sz="4"/>
-              <w:bottom w:val="single" w:color="BFBFBF" w:sz="4"/>
-              <w:right w:val="single" w:color="BFBFBF" w:sz="4"/>
-            </w:tcBorders>
-            <w:tcMar>
-              <w:top w:type="dxa" w:w="80"/>
-              <w:left w:type="dxa" w:w="120"/>
-              <w:bottom w:type="dxa" w:w="80"/>
-              <w:right w:type="dxa" w:w="120"/>
-            </w:tcMar>
-          </w:tcPr>
-          <w:p>
-            <w:r>
-              <w:rPr>
-                <w:b w:val="false"/>
-                <w:bCs w:val="false"/>
-                <w:sz w:val="18"/>
-                <w:szCs w:val="18"/>
-              </w:rPr>
-              <w:t xml:space="preserve">monitor.py</w:t>
-            </w:r>
-          </w:p>
-        </w:tc>
-        <w:tc>
-          <w:tcPr>
-            <w:tcW w:type="dxa" w:w="5560"/>
-            <w:tcBorders>
-              <w:top w:val="single" w:color="BFBFBF" w:sz="4"/>
-              <w:left w:val="single" w:color="BFBFBF" w:sz="4"/>
-              <w:bottom w:val="single" w:color="BFBFBF" w:sz="4"/>
-              <w:right w:val="single" w:color="BFBFBF" w:sz="4"/>
-            </w:tcBorders>
-            <w:tcMar>
-              <w:top w:type="dxa" w:w="80"/>
-              <w:left w:type="dxa" w:w="120"/>
-              <w:bottom w:type="dxa" w:w="80"/>
-              <w:right w:type="dxa" w:w="120"/>
-            </w:tcMar>
-          </w:tcPr>
-          <w:p>
-            <w:r>
-              <w:rPr>
-                <w:b w:val="false"/>
-                <w:bCs w:val="false"/>
-                <w:sz w:val="18"/>
-                <w:szCs w:val="18"/>
-              </w:rPr>
-              <w:t xml:space="preserve">Script principal</w:t>
-            </w:r>
-          </w:p>
-        </w:tc>
-      </w:tr>
-      <w:tr>
-        <w:trPr>
-          <w:tblHeader w:val="false"/>
-        </w:trPr>
-        <w:tc>
-          <w:tcPr>
-            <w:tcW w:type="dxa" w:w="3800"/>
-            <w:tcBorders>
-              <w:top w:val="single" w:color="BFBFBF" w:sz="4"/>
-              <w:left w:val="single" w:color="BFBFBF" w:sz="4"/>
-              <w:bottom w:val="single" w:color="BFBFBF" w:sz="4"/>
-              <w:right w:val="single" w:color="BFBFBF" w:sz="4"/>
-            </w:tcBorders>
-            <w:tcMar>
-              <w:top w:type="dxa" w:w="80"/>
-              <w:left w:type="dxa" w:w="120"/>
-              <w:bottom w:type="dxa" w:w="80"/>
-              <w:right w:type="dxa" w:w="120"/>
-            </w:tcMar>
-          </w:tcPr>
-          <w:p>
-            <w:r>
-              <w:rPr>
-                <w:b w:val="false"/>
-                <w:bCs w:val="false"/>
-                <w:sz w:val="18"/>
-                <w:szCs w:val="18"/>
-              </w:rPr>
-              <w:t xml:space="preserve">watchlist.csv</w:t>
-            </w:r>
-          </w:p>
-        </w:tc>
-        <w:tc>
-          <w:tcPr>
-            <w:tcW w:type="dxa" w:w="5560"/>
-            <w:tcBorders>
-              <w:top w:val="single" w:color="BFBFBF" w:sz="4"/>
-              <w:left w:val="single" w:color="BFBFBF" w:sz="4"/>
-              <w:bottom w:val="single" w:color="BFBFBF" w:sz="4"/>
-              <w:right w:val="single" w:color="BFBFBF" w:sz="4"/>
-            </w:tcBorders>
-            <w:tcMar>
-              <w:top w:type="dxa" w:w="80"/>
-              <w:left w:type="dxa" w:w="120"/>
-              <w:bottom w:type="dxa" w:w="80"/>
-              <w:right w:type="dxa" w:w="120"/>
-            </w:tcMar>
-          </w:tcPr>
-          <w:p>
-            <w:r>
-              <w:rPr>
-                <w:b w:val="false"/>
-                <w:bCs w:val="false"/>
-                <w:sz w:val="18"/>
-                <w:szCs w:val="18"/>
-              </w:rPr>
-              <w:t xml:space="preserve">Lista de devedores monitorados (editável no Excel)</w:t>
-            </w:r>
-          </w:p>
-        </w:tc>
-      </w:tr>
-      <w:tr>
-        <w:trPr>
-          <w:tblHeader w:val="false"/>
-        </w:trPr>
-        <w:tc>
-          <w:tcPr>
-            <w:tcW w:type="dxa" w:w="3800"/>
-            <w:tcBorders>
-              <w:top w:val="single" w:color="BFBFBF" w:sz="4"/>
-              <w:left w:val="single" w:color="BFBFBF" w:sz="4"/>
-              <w:bottom w:val="single" w:color="BFBFBF" w:sz="4"/>
-              <w:right w:val="single" w:color="BFBFBF" w:sz="4"/>
-            </w:tcBorders>
-            <w:tcMar>
-              <w:top w:type="dxa" w:w="80"/>
-              <w:left w:type="dxa" w:w="120"/>
-              <w:bottom w:type="dxa" w:w="80"/>
-              <w:right w:type="dxa" w:w="120"/>
-            </w:tcMar>
-          </w:tcPr>
-          <w:p>
-            <w:r>
-              <w:rPr>
-                <w:b w:val="false"/>
-                <w:bCs w:val="false"/>
-                <w:sz w:val="18"/>
-                <w:szCs w:val="18"/>
-              </w:rPr>
-              <w:t xml:space="preserve">requirements.txt</w:t>
-            </w:r>
-          </w:p>
-        </w:tc>
-        <w:tc>
-          <w:tcPr>
-            <w:tcW w:type="dxa" w:w="5560"/>
-            <w:tcBorders>
-              <w:top w:val="single" w:color="BFBFBF" w:sz="4"/>
-              <w:left w:val="single" w:color="BFBFBF" w:sz="4"/>
-              <w:bottom w:val="single" w:color="BFBFBF" w:sz="4"/>
-              <w:right w:val="single" w:color="BFBFBF" w:sz="4"/>
-            </w:tcBorders>
-            <w:tcMar>
-              <w:top w:type="dxa" w:w="80"/>
-              <w:left w:type="dxa" w:w="120"/>
-              <w:bottom w:type="dxa" w:w="80"/>
-              <w:right w:type="dxa" w:w="120"/>
-            </w:tcMar>
-          </w:tcPr>
-          <w:p>
-            <w:r>
-              <w:rPr>
-                <w:b w:val="false"/>
-                <w:bCs w:val="false"/>
-                <w:sz w:val="18"/>
-                <w:szCs w:val="18"/>
-              </w:rPr>
-              <w:t xml:space="preserve">Dependências Python</w:t>
-            </w:r>
-          </w:p>
-        </w:tc>
-      </w:tr>
-      <w:tr>
-        <w:trPr>
-          <w:tblHeader w:val="false"/>
-        </w:trPr>
-        <w:tc>
-          <w:tcPr>
-            <w:tcW w:type="dxa" w:w="3800"/>
-            <w:tcBorders>
-              <w:top w:val="single" w:color="BFBFBF" w:sz="4"/>
-              <w:left w:val="single" w:color="BFBFBF" w:sz="4"/>
-              <w:bottom w:val="single" w:color="BFBFBF" w:sz="4"/>
-              <w:right w:val="single" w:color="BFBFBF" w:sz="4"/>
-            </w:tcBorders>
-            <w:tcMar>
-              <w:top w:type="dxa" w:w="80"/>
-              <w:left w:type="dxa" w:w="120"/>
-              <w:bottom w:type="dxa" w:w="80"/>
-              <w:right w:type="dxa" w:w="120"/>
-            </w:tcMar>
-          </w:tcPr>
-          <w:p>
-            <w:r>
-              <w:rPr>
-                <w:b w:val="false"/>
-                <w:bCs w:val="false"/>
-                <w:sz w:val="18"/>
-                <w:szCs w:val="18"/>
-              </w:rPr>
-              <w:t xml:space="preserve">run_weekly.bat</w:t>
-            </w:r>
-          </w:p>
-        </w:tc>
-        <w:tc>
-          <w:tcPr>
-            <w:tcW w:type="dxa" w:w="5560"/>
-            <w:tcBorders>
-              <w:top w:val="single" w:color="BFBFBF" w:sz="4"/>
-              <w:left w:val="single" w:color="BFBFBF" w:sz="4"/>
-              <w:bottom w:val="single" w:color="BFBFBF" w:sz="4"/>
-              <w:right w:val="single" w:color="BFBFBF" w:sz="4"/>
-            </w:tcBorders>
-            <w:tcMar>
-              <w:top w:type="dxa" w:w="80"/>
-              <w:left w:type="dxa" w:w="120"/>
-              <w:bottom w:type="dxa" w:w="80"/>
-              <w:right w:type="dxa" w:w="120"/>
-            </w:tcMar>
-          </w:tcPr>
-          <w:p>
-            <w:r>
-              <w:rPr>
-                <w:b w:val="false"/>
-                <w:bCs w:val="false"/>
-                <w:sz w:val="18"/>
-                <w:szCs w:val="18"/>
-              </w:rPr>
-              <w:t xml:space="preserve">Disparado pelo Windows no login</w:t>
-            </w:r>
-          </w:p>
-        </w:tc>
-      </w:tr>
-      <w:tr>
-        <w:trPr>
-          <w:tblHeader w:val="false"/>
-        </w:trPr>
-        <w:tc>
-          <w:tcPr>
-            <w:tcW w:type="dxa" w:w="3800"/>
-            <w:tcBorders>
-              <w:top w:val="single" w:color="BFBFBF" w:sz="4"/>
-              <w:left w:val="single" w:color="BFBFBF" w:sz="4"/>
-              <w:bottom w:val="single" w:color="BFBFBF" w:sz="4"/>
-              <w:right w:val="single" w:color="BFBFBF" w:sz="4"/>
-            </w:tcBorders>
-            <w:tcMar>
-              <w:top w:type="dxa" w:w="80"/>
-              <w:left w:type="dxa" w:w="120"/>
-              <w:bottom w:type="dxa" w:w="80"/>
-              <w:right w:type="dxa" w:w="120"/>
-            </w:tcMar>
-          </w:tcPr>
-          <w:p>
-            <w:r>
-              <w:rPr>
-                <w:b w:val="false"/>
-                <w:bCs w:val="false"/>
-                <w:sz w:val="18"/>
-                <w:szCs w:val="18"/>
-              </w:rPr>
-              <w:t xml:space="preserve">listar_emissores.py</w:t>
-            </w:r>
-          </w:p>
-        </w:tc>
-        <w:tc>
-          <w:tcPr>
-            <w:tcW w:type="dxa" w:w="5560"/>
-            <w:tcBorders>
-              <w:top w:val="single" w:color="BFBFBF" w:sz="4"/>
-              <w:left w:val="single" w:color="BFBFBF" w:sz="4"/>
-              <w:bottom w:val="single" w:color="BFBFBF" w:sz="4"/>
-              <w:right w:val="single" w:color="BFBFBF" w:sz="4"/>
-            </w:tcBorders>
-            <w:tcMar>
-              <w:top w:type="dxa" w:w="80"/>
-              <w:left w:type="dxa" w:w="120"/>
-              <w:bottom w:type="dxa" w:w="80"/>
-              <w:right w:type="dxa" w:w="120"/>
-            </w:tcMar>
-          </w:tcPr>
-          <w:p>
-            <w:r>
-              <w:rPr>
-                <w:b w:val="false"/>
-                <w:bCs w:val="false"/>
-                <w:sz w:val="18"/>
-                <w:szCs w:val="18"/>
-              </w:rPr>
-              <w:t xml:space="preserve">Utilitário para descobrir CNPJs corretos</w:t>
-            </w:r>
-          </w:p>
-        </w:tc>
-      </w:tr>
-      <w:tr>
-        <w:trPr>
-          <w:tblHeader w:val="false"/>
-        </w:trPr>
-        <w:tc>
-          <w:tcPr>
-            <w:tcW w:type="dxa" w:w="3800"/>
-            <w:tcBorders>
-              <w:top w:val="single" w:color="BFBFBF" w:sz="4"/>
-              <w:left w:val="single" w:color="BFBFBF" w:sz="4"/>
-              <w:bottom w:val="single" w:color="BFBFBF" w:sz="4"/>
-              <w:right w:val="single" w:color="BFBFBF" w:sz="4"/>
-            </w:tcBorders>
-            <w:tcMar>
-              <w:top w:type="dxa" w:w="80"/>
-              <w:left w:type="dxa" w:w="120"/>
-              <w:bottom w:type="dxa" w:w="80"/>
-              <w:right w:type="dxa" w:w="120"/>
-            </w:tcMar>
-          </w:tcPr>
-          <w:p>
-            <w:r>
-              <w:rPr>
-                <w:b w:val="false"/>
-                <w:bCs w:val="false"/>
-                <w:sz w:val="18"/>
-                <w:szCs w:val="18"/>
-              </w:rPr>
-              <w:t xml:space="preserve">historico/historico.csv</w:t>
-            </w:r>
-          </w:p>
-        </w:tc>
-        <w:tc>
-          <w:tcPr>
-            <w:tcW w:type="dxa" w:w="5560"/>
-            <w:tcBorders>
-              <w:top w:val="single" w:color="BFBFBF" w:sz="4"/>
-              <w:left w:val="single" w:color="BFBFBF" w:sz="4"/>
-              <w:bottom w:val="single" w:color="BFBFBF" w:sz="4"/>
-              <w:right w:val="single" w:color="BFBFBF" w:sz="4"/>
-            </w:tcBorders>
-            <w:tcMar>
-              <w:top w:type="dxa" w:w="80"/>
-              <w:left w:type="dxa" w:w="120"/>
-              <w:bottom w:type="dxa" w:w="80"/>
-              <w:right w:type="dxa" w:w="120"/>
-            </w:tcMar>
-          </w:tcPr>
-          <w:p>
-            <w:r>
-              <w:rPr>
-                <w:b w:val="false"/>
-                <w:bCs w:val="false"/>
-                <w:sz w:val="18"/>
-                <w:szCs w:val="18"/>
-              </w:rPr>
-              <w:t xml:space="preserve">Fonte-verdade auditável</w:t>
-            </w:r>
-          </w:p>
-        </w:tc>
-      </w:tr>
-      <w:tr>
-        <w:trPr>
-          <w:tblHeader w:val="false"/>
-        </w:trPr>
-        <w:tc>
-          <w:tcPr>
-            <w:tcW w:type="dxa" w:w="3800"/>
-            <w:tcBorders>
-              <w:top w:val="single" w:color="BFBFBF" w:sz="4"/>
-              <w:left w:val="single" w:color="BFBFBF" w:sz="4"/>
-              <w:bottom w:val="single" w:color="BFBFBF" w:sz="4"/>
-              <w:right w:val="single" w:color="BFBFBF" w:sz="4"/>
-            </w:tcBorders>
-            <w:tcMar>
-              <w:top w:type="dxa" w:w="80"/>
-              <w:left w:type="dxa" w:w="120"/>
-              <w:bottom w:type="dxa" w:w="80"/>
-              <w:right w:type="dxa" w:w="120"/>
-            </w:tcMar>
-          </w:tcPr>
-          <w:p>
-            <w:r>
-              <w:rPr>
-                <w:b w:val="false"/>
-                <w:bCs w:val="false"/>
-                <w:sz w:val="18"/>
-                <w:szCs w:val="18"/>
-              </w:rPr>
-              <w:t xml:space="preserve">historico/historico_eventos.xlsx</w:t>
-            </w:r>
-          </w:p>
-        </w:tc>
-        <w:tc>
-          <w:tcPr>
-            <w:tcW w:type="dxa" w:w="5560"/>
-            <w:tcBorders>
-              <w:top w:val="single" w:color="BFBFBF" w:sz="4"/>
-              <w:left w:val="single" w:color="BFBFBF" w:sz="4"/>
-              <w:bottom w:val="single" w:color="BFBFBF" w:sz="4"/>
-              <w:right w:val="single" w:color="BFBFBF" w:sz="4"/>
-            </w:tcBorders>
-            <w:tcMar>
-              <w:top w:type="dxa" w:w="80"/>
-              <w:left w:type="dxa" w:w="120"/>
-              <w:bottom w:type="dxa" w:w="80"/>
-              <w:right w:type="dxa" w:w="120"/>
-            </w:tcMar>
-          </w:tcPr>
-          <w:p>
-            <w:r>
-              <w:rPr>
-                <w:b w:val="false"/>
-                <w:bCs w:val="false"/>
-                <w:sz w:val="18"/>
-                <w:szCs w:val="18"/>
-              </w:rPr>
-              <w:t xml:space="preserve">Planilha visual</w:t>
-            </w:r>
-          </w:p>
-        </w:tc>
-      </w:tr>
-      <w:tr>
-        <w:trPr>
-          <w:tblHeader w:val="false"/>
-        </w:trPr>
-        <w:tc>
-          <w:tcPr>
-            <w:tcW w:type="dxa" w:w="3800"/>
-            <w:tcBorders>
-              <w:top w:val="single" w:color="BFBFBF" w:sz="4"/>
-              <w:left w:val="single" w:color="BFBFBF" w:sz="4"/>
-              <w:bottom w:val="single" w:color="BFBFBF" w:sz="4"/>
-              <w:right w:val="single" w:color="BFBFBF" w:sz="4"/>
-            </w:tcBorders>
-            <w:tcMar>
-              <w:top w:type="dxa" w:w="80"/>
-              <w:left w:type="dxa" w:w="120"/>
-              <w:bottom w:type="dxa" w:w="80"/>
-              <w:right w:type="dxa" w:w="120"/>
-            </w:tcMar>
-          </w:tcPr>
-          <w:p>
-            <w:r>
-              <w:rPr>
-                <w:b w:val="false"/>
-                <w:bCs w:val="false"/>
-                <w:sz w:val="18"/>
-                <w:szCs w:val="18"/>
-              </w:rPr>
-              <w:t xml:space="preserve">output/events_AAAAMMDD.json</w:t>
-            </w:r>
-          </w:p>
-        </w:tc>
-        <w:tc>
-          <w:tcPr>
-            <w:tcW w:type="dxa" w:w="5560"/>
-            <w:tcBorders>
-              <w:top w:val="single" w:color="BFBFBF" w:sz="4"/>
-              <w:left w:val="single" w:color="BFBFBF" w:sz="4"/>
-              <w:bottom w:val="single" w:color="BFBFBF" w:sz="4"/>
-              <w:right w:val="single" w:color="BFBFBF" w:sz="4"/>
-            </w:tcBorders>
-            <w:tcMar>
-              <w:top w:type="dxa" w:w="80"/>
-              <w:left w:type="dxa" w:w="120"/>
-              <w:bottom w:type="dxa" w:w="80"/>
-              <w:right w:type="dxa" w:w="120"/>
-            </w:tcMar>
-          </w:tcPr>
-          <w:p>
-            <w:r>
-              <w:rPr>
-                <w:b w:val="false"/>
-                <w:bCs w:val="false"/>
-                <w:sz w:val="18"/>
-                <w:szCs w:val="18"/>
-              </w:rPr>
-              <w:t xml:space="preserve">Snapshot de cada execução</w:t>
-            </w:r>
-          </w:p>
-        </w:tc>
-      </w:tr>
-      <w:tr>
-        <w:trPr>
-          <w:tblHeader w:val="false"/>
-        </w:trPr>
-        <w:tc>
-          <w:tcPr>
-            <w:tcW w:type="dxa" w:w="3800"/>
-            <w:tcBorders>
-              <w:top w:val="single" w:color="BFBFBF" w:sz="4"/>
-              <w:left w:val="single" w:color="BFBFBF" w:sz="4"/>
-              <w:bottom w:val="single" w:color="BFBFBF" w:sz="4"/>
-              <w:right w:val="single" w:color="BFBFBF" w:sz="4"/>
-            </w:tcBorders>
-            <w:tcMar>
-              <w:top w:type="dxa" w:w="80"/>
-              <w:left w:type="dxa" w:w="120"/>
-              <w:bottom w:type="dxa" w:w="80"/>
-              <w:right w:type="dxa" w:w="120"/>
-            </w:tcMar>
-          </w:tcPr>
-          <w:p>
-            <w:r>
-              <w:rPr>
-                <w:b w:val="false"/>
-                <w:bCs w:val="false"/>
-                <w:sz w:val="18"/>
-                <w:szCs w:val="18"/>
-              </w:rPr>
-              <w:t xml:space="preserve">state/seen_events.json</w:t>
-            </w:r>
-          </w:p>
-        </w:tc>
-        <w:tc>
-          <w:tcPr>
-            <w:tcW w:type="dxa" w:w="5560"/>
-            <w:tcBorders>
-              <w:top w:val="single" w:color="BFBFBF" w:sz="4"/>
-              <w:left w:val="single" w:color="BFBFBF" w:sz="4"/>
-              <w:bottom w:val="single" w:color="BFBFBF" w:sz="4"/>
-              <w:right w:val="single" w:color="BFBFBF" w:sz="4"/>
-            </w:tcBorders>
-            <w:tcMar>
-              <w:top w:type="dxa" w:w="80"/>
-              <w:left w:type="dxa" w:w="120"/>
-              <w:bottom w:type="dxa" w:w="80"/>
-              <w:right w:type="dxa" w:w="120"/>
-            </w:tcMar>
-          </w:tcPr>
-          <w:p>
-            <w:r>
-              <w:rPr>
-                <w:b w:val="false"/>
-                <w:bCs w:val="false"/>
-                <w:sz w:val="18"/>
-                <w:szCs w:val="18"/>
-              </w:rPr>
-              <w:t xml:space="preserve">Controle de deduplicação</w:t>
-            </w:r>
-          </w:p>
-        </w:tc>
-      </w:tr>
-      <w:tr>
-        <w:trPr>
-          <w:tblHeader w:val="false"/>
-        </w:trPr>
-        <w:tc>
-          <w:tcPr>
-            <w:tcW w:type="dxa" w:w="3800"/>
-            <w:tcBorders>
-              <w:top w:val="single" w:color="BFBFBF" w:sz="4"/>
-              <w:left w:val="single" w:color="BFBFBF" w:sz="4"/>
-              <w:bottom w:val="single" w:color="BFBFBF" w:sz="4"/>
-              <w:right w:val="single" w:color="BFBFBF" w:sz="4"/>
-            </w:tcBorders>
-            <w:tcMar>
-              <w:top w:type="dxa" w:w="80"/>
-              <w:left w:type="dxa" w:w="120"/>
-              <w:bottom w:type="dxa" w:w="80"/>
-              <w:right w:type="dxa" w:w="120"/>
-            </w:tcMar>
-          </w:tcPr>
-          <w:p>
-            <w:r>
-              <w:rPr>
-                <w:b w:val="false"/>
-                <w:bCs w:val="false"/>
-                <w:sz w:val="18"/>
-                <w:szCs w:val="18"/>
-              </w:rPr>
-              <w:t xml:space="preserve">logs/run_AAAAMMDD.log</w:t>
-            </w:r>
-          </w:p>
-        </w:tc>
-        <w:tc>
-          <w:tcPr>
-            <w:tcW w:type="dxa" w:w="5560"/>
-            <w:tcBorders>
-              <w:top w:val="single" w:color="BFBFBF" w:sz="4"/>
-              <w:left w:val="single" w:color="BFBFBF" w:sz="4"/>
-              <w:bottom w:val="single" w:color="BFBFBF" w:sz="4"/>
-              <w:right w:val="single" w:color="BFBFBF" w:sz="4"/>
-            </w:tcBorders>
-            <w:tcMar>
-              <w:top w:type="dxa" w:w="80"/>
-              <w:left w:type="dxa" w:w="120"/>
-              <w:bottom w:type="dxa" w:w="80"/>
-              <w:right w:type="dxa" w:w="120"/>
-            </w:tcMar>
-          </w:tcPr>
-          <w:p>
-            <w:r>
-              <w:rPr>
-                <w:b w:val="false"/>
-                <w:bCs w:val="false"/>
-                <w:sz w:val="18"/>
-                <w:szCs w:val="18"/>
-              </w:rPr>
-              <w:t xml:space="preserve">Log de cada execução</w:t>
-            </w:r>
-          </w:p>
-        </w:tc>
-      </w:tr>
-      <w:tr>
-        <w:trPr>
-          <w:tblHeader w:val="false"/>
-        </w:trPr>
-        <w:tc>
-          <w:tcPr>
-            <w:tcW w:type="dxa" w:w="3800"/>
-            <w:tcBorders>
-              <w:top w:val="single" w:color="BFBFBF" w:sz="4"/>
-              <w:left w:val="single" w:color="BFBFBF" w:sz="4"/>
-              <w:bottom w:val="single" w:color="BFBFBF" w:sz="4"/>
-              <w:right w:val="single" w:color="BFBFBF" w:sz="4"/>
-            </w:tcBorders>
-            <w:tcMar>
-              <w:top w:type="dxa" w:w="80"/>
-              <w:left w:type="dxa" w:w="120"/>
-              <w:bottom w:type="dxa" w:w="80"/>
-              <w:right w:type="dxa" w:w="120"/>
-            </w:tcMar>
-          </w:tcPr>
-          <w:p>
-            <w:r>
-              <w:rPr>
-                <w:b w:val="false"/>
-                <w:bCs w:val="false"/>
-                <w:sz w:val="18"/>
-                <w:szCs w:val="18"/>
-              </w:rPr>
-              <w:t xml:space="preserve">00. Relatório de Tarefa MVP/</w:t>
-            </w:r>
-          </w:p>
-        </w:tc>
-        <w:tc>
-          <w:tcPr>
-            <w:tcW w:type="dxa" w:w="5560"/>
-            <w:tcBorders>
-              <w:top w:val="single" w:color="BFBFBF" w:sz="4"/>
-              <w:left w:val="single" w:color="BFBFBF" w:sz="4"/>
-              <w:bottom w:val="single" w:color="BFBFBF" w:sz="4"/>
-              <w:right w:val="single" w:color="BFBFBF" w:sz="4"/>
-            </w:tcBorders>
-            <w:tcMar>
-              <w:top w:type="dxa" w:w="80"/>
-              <w:left w:type="dxa" w:w="120"/>
-              <w:bottom w:type="dxa" w:w="80"/>
-              <w:right w:type="dxa" w:w="120"/>
-            </w:tcMar>
-          </w:tcPr>
-          <w:p>
-            <w:r>
-              <w:rPr>
-                <w:b w:val="false"/>
-                <w:bCs w:val="false"/>
-                <w:sz w:val="18"/>
-                <w:szCs w:val="18"/>
-              </w:rPr>
-              <w:t xml:space="preserve">Esta pasta — contém este Word e o PDF padrão Marvin</w:t>
-            </w:r>
-          </w:p>
-        </w:tc>
-      </w:tr>
-    </w:tbl>
+        <w:t xml:space="preserve">No GitHub (organização Marvin):</w:t>
+      </w:r>
+    </w:p>
+    <w:p>
+      <w:pPr>
+        <w:shd w:fill="F2F2F2" w:val="clear"/>
+        <w:spacing w:after="160" w:before="60"/>
+      </w:pPr>
+      <w:r>
+        <w:rPr>
+          <w:rFonts w:ascii="Consolas" w:cs="Consolas" w:eastAsia="Consolas" w:hAnsi="Consolas"/>
+          <w:sz w:val="18"/>
+          <w:szCs w:val="18"/>
+        </w:rPr>
+        <w:t xml:space="preserve">github.com/marvin-monitoramento/marvin-cvm-fatos-relevantes/
+  ├── 02. Histórico/                                 (planilha + CSV, atualizados pelo cron)
+  ├── data/                                          (state interno: seen_events, last_run)
+  ├── docs/                                          (PDF, Word, comunicação interna)
+  ├── .github/workflows/daily.yml                    (cron 10h BRT)
+  ├── monitor.py, watchlist.csv, requirements.txt    (código + config)
+  ├── README.md, DEPLOY.md                           (operação)
+  └── PROCEDIMENTO-Regeneracao-Token-ClickUp.md      (sucessão técnica)</w:t>
+      </w:r>
+    </w:p>
     <w:p>
       <w:pPr>
         <w:pStyle w:val="Heading1"/>
@@ -5004,7 +3731,7 @@
           <w:sz w:val="24"/>
           <w:szCs w:val="24"/>
         </w:rPr>
-        <w:t xml:space="preserve">4.1. Configuração atual: Pasta de Inicialização</w:t>
+        <w:t xml:space="preserve">4.1. Camada cloud (recomendada como canal oficial)</w:t>
       </w:r>
     </w:p>
     <w:p>
@@ -5012,7 +3739,7 @@
         <w:spacing w:after="120"/>
       </w:pPr>
       <w:r>
-        <w:t xml:space="preserve">O sistema está configurado para rodar automaticamente toda vez que a máquina é ligada e a responsável faz login no Windows. Isso é feito por um atalho do run_weekly.bat dentro da Pasta de Inicialização do Windows (acessível via tecla Windows + R → digitar shell:startup → Enter).</w:t>
+        <w:t xml:space="preserve">O monitor roda no GitHub Actions de forma totalmente autônoma. Não depende de máquina local ligada, não depende de aplicativos abertos. O cron foi configurado em horário fixo (10h BRT diariamente).</w:t>
       </w:r>
     </w:p>
     <w:p>
@@ -5020,7 +3747,7 @@
         <w:spacing w:after="120"/>
       </w:pPr>
       <w:r>
-        <w:t xml:space="preserve">Vantagem: zero permissão administrativa exigida (não depende do TI da Marvin), zero dependência de senhas. Desvantagem: só roda enquanto a responsável estiver logada no Windows. Se ficar dias sem ligar, o lookback de 10 dias dá margem para recuperar o que foi perdido na próxima execução.</w:t>
+        <w:t xml:space="preserve">Disparo automático: cron '0 13 * * *' (13h UTC = 10h BRT). Disparo manual: aba Actions → Run workflow.</w:t>
       </w:r>
     </w:p>
     <w:p>
@@ -5036,7 +3763,7 @@
           <w:sz w:val="24"/>
           <w:szCs w:val="24"/>
         </w:rPr>
-        <w:t xml:space="preserve">4.2. Por que não usamos o Agendador de Tarefas</w:t>
+        <w:t xml:space="preserve">4.2. Camada local (redundância)</w:t>
       </w:r>
     </w:p>
     <w:p>
@@ -5044,15 +3771,7 @@
         <w:spacing w:after="120"/>
       </w:pPr>
       <w:r>
-        <w:t xml:space="preserve">Tentamos configurar o Agendador de Tarefas do Windows para disparo em horário fixo (ex.: 14h diariamente), mas o ambiente corporativo da Marvin restringe permissões. A primeira tentativa retornou erro de credenciais. A segunda configuração (com 'Executar somente quando o usuário estiver conectado') ficou bloqueada por condições padrão do Windows (Launch condition not met).</w:t>
-      </w:r>
-    </w:p>
-    <w:p>
-      <w:pPr>
-        <w:spacing w:after="120"/>
-      </w:pPr>
-      <w:r>
-        <w:t xml:space="preserve">A Pasta de Inicialização foi o caminho pragmático — funciona sem TI, é confiável e cobre o caso de uso. Caso o time queira disparar em horário fixo no futuro, o passo a passo do Agendador está documentado no arquivo AGENDAMENTO.md dentro da pasta do projeto.</w:t>
+        <w:t xml:space="preserve">O monitor local roda na máquina da responsável a cada login do Windows, via atalho na Pasta de Inicialização. Esta camada fica como redundância pessoal — se o cloud falhar por qualquer motivo, o local continua registrando histórico. A pasta também serve como espaço de trabalho da responsável (testes locais).</w:t>
       </w:r>
     </w:p>
     <w:p>
@@ -5081,7 +3800,7 @@
         <w:spacing w:after="80"/>
       </w:pPr>
       <w:r>
-        <w:t xml:space="preserve">Computador da responsável ligado e logado no Windows.</w:t>
+        <w:t xml:space="preserve">Cloud (canal oficial): nada — sistema 100% autônomo no servidor do GitHub.</w:t>
       </w:r>
     </w:p>
     <w:p>
@@ -5094,92 +3813,9 @@
         <w:spacing w:after="80"/>
       </w:pPr>
       <w:r>
-        <w:t xml:space="preserve">Outlook aberto (necessário para o e-mail diário sair via pywin32).</w:t>
-      </w:r>
-    </w:p>
-    <w:p>
-      <w:pPr>
-        <w:pStyle w:val="ListParagraph"/>
-        <w:numPr>
-          <w:ilvl w:val="0"/>
-          <w:numId w:val="2"/>
-        </w:numPr>
-        <w:spacing w:after="80"/>
-      </w:pPr>
-      <w:r>
-        <w:t xml:space="preserve">Acesso à internet (o script chega em dados.cvm.gov.br).</w:t>
-      </w:r>
-    </w:p>
-    <w:p>
-      <w:pPr>
-        <w:pStyle w:val="ListParagraph"/>
-        <w:numPr>
-          <w:ilvl w:val="0"/>
-          <w:numId w:val="2"/>
-        </w:numPr>
-        <w:spacing w:after="80"/>
-      </w:pPr>
-      <w:r>
-        <w:t xml:space="preserve">Python 3.10+ instalado com pandas, requests, openpyxl, pywin32.</w:t>
-      </w:r>
-    </w:p>
-    <w:p>
-      <w:pPr>
-        <w:spacing w:after="60"/>
-      </w:pPr>
-      <w:r>
-        <w:t xml:space="preserve"/>
-      </w:r>
-    </w:p>
-    <w:tbl>
-      <w:tblPr>
-        <w:tblW w:type="dxa" w:w="9360"/>
-        <w:tblBorders>
-          <w:top w:val="single" w:color="auto" w:sz="4"/>
-          <w:left w:val="single" w:color="auto" w:sz="4"/>
-          <w:bottom w:val="single" w:color="auto" w:sz="4"/>
-          <w:right w:val="single" w:color="auto" w:sz="4"/>
-          <w:insideH w:val="single" w:color="auto" w:sz="4"/>
-          <w:insideV w:val="single" w:color="auto" w:sz="4"/>
-        </w:tblBorders>
-      </w:tblPr>
-      <w:tblGrid>
-        <w:gridCol w:w="9360"/>
-      </w:tblGrid>
-      <w:tr>
-        <w:tc>
-          <w:tcPr>
-            <w:tcW w:type="dxa" w:w="9360"/>
-            <w:tcBorders>
-              <w:top w:val="single" w:color="E6B800" w:sz="6"/>
-              <w:left w:val="single" w:color="E6B800" w:sz="6"/>
-              <w:bottom w:val="single" w:color="E6B800" w:sz="6"/>
-              <w:right w:val="single" w:color="E6B800" w:sz="6"/>
-            </w:tcBorders>
-            <w:shd w:fill="FFF4CE" w:val="clear"/>
-            <w:tcMar>
-              <w:top w:type="dxa" w:w="120"/>
-              <w:left w:type="dxa" w:w="200"/>
-              <w:bottom w:type="dxa" w:w="120"/>
-              <w:right w:type="dxa" w:w="200"/>
-            </w:tcMar>
-          </w:tcPr>
-          <w:p>
-            <w:r>
-              <w:rPr>
-                <w:b/>
-                <w:bCs/>
-                <w:color w:val="8B6914"/>
-              </w:rPr>
-              <w:t xml:space="preserve">ATENÇÃO: </w:t>
-            </w:r>
-            <w:r>
-              <w:t xml:space="preserve">Se o Outlook não estiver aberto, o monitor ainda roda e atualiza a planilha, mas o e-mail diário não é enviado. O log mostra a falha, e na próxima execução com Outlook aberto o e-mail volta normalmente.</w:t>
-            </w:r>
-          </w:p>
-        </w:tc>
-      </w:tr>
-    </w:tbl>
+        <w:t xml:space="preserve">Local (redundância): computador da responsável ligado, logado no Windows, Outlook aberto.</w:t>
+      </w:r>
+    </w:p>
     <w:p>
       <w:pPr>
         <w:pStyle w:val="Heading1"/>
@@ -5193,7 +3829,15 @@
           <w:sz w:val="30"/>
           <w:szCs w:val="30"/>
         </w:rPr>
-        <w:t xml:space="preserve">5. Como Operar Sem a Responsável Atual</w:t>
+        <w:t xml:space="preserve">5. Plano de Sucessão</w:t>
+      </w:r>
+    </w:p>
+    <w:p>
+      <w:pPr>
+        <w:spacing w:after="120"/>
+      </w:pPr>
+      <w:r>
+        <w:t xml:space="preserve">Esta seção descreve como manter o monitoramento operacional caso a responsável atual saia da Marvin, seja por troca de função, licença ou desligamento. A maior parte dos riscos de continuidade foi mitigada pela transferência do repositório para a organização Marvin e pela documentação institucional do procedimento de regeneração do token ClickUp.</w:t>
       </w:r>
     </w:p>
     <w:p>
@@ -5209,23 +3853,7 @@
           <w:sz w:val="24"/>
           <w:szCs w:val="24"/>
         </w:rPr>
-        <w:t xml:space="preserve">5.1. Manutenção rotineira</w:t>
-      </w:r>
-    </w:p>
-    <w:p>
-      <w:pPr>
-        <w:pStyle w:val="Heading3"/>
-        <w:spacing w:after="100" w:before="180"/>
-      </w:pPr>
-      <w:r>
-        <w:rPr>
-          <w:b/>
-          <w:bCs/>
-          <w:color w:val="1F3864"/>
-          <w:sz w:val="22"/>
-          <w:szCs w:val="22"/>
-        </w:rPr>
-        <w:t xml:space="preserve">Adicionar um novo devedor</w:t>
+        <w:t xml:space="preserve">5.1. Cenário 1: Saída programada</w:t>
       </w:r>
     </w:p>
     <w:p>
@@ -5238,7 +3866,7 @@
         <w:spacing w:after="80"/>
       </w:pPr>
       <w:r>
-        <w:t xml:space="preserve">Abrir o arquivo watchlist.csv no Excel.</w:t>
+        <w:t xml:space="preserve">Identificar o substituto, idealmente alguém do time de Risco.</w:t>
       </w:r>
     </w:p>
     <w:p>
@@ -5251,7 +3879,7 @@
         <w:spacing w:after="80"/>
       </w:pPr>
       <w:r>
-        <w:t xml:space="preserve">Adicionar uma nova linha com o CNPJ do devedor (qualquer filial — o matching é por raiz).</w:t>
+        <w:t xml:space="preserve">Adicionar o substituto como Admin do repositório (Settings → Collaborators).</w:t>
       </w:r>
     </w:p>
     <w:p>
@@ -5264,7 +3892,7 @@
         <w:spacing w:after="80"/>
       </w:pPr>
       <w:r>
-        <w:t xml:space="preserve">Salvar (manter formato CSV separado por vírgulas).</w:t>
+        <w:t xml:space="preserve">Executar o procedimento de regeneração do token ClickUp (10 minutos, ver PROCEDIMENTO-Regeneracao-Token-ClickUp.md).</w:t>
       </w:r>
     </w:p>
     <w:p>
@@ -5277,23 +3905,7 @@
         <w:spacing w:after="80"/>
       </w:pPr>
       <w:r>
-        <w:t xml:space="preserve">Pronto. Na próxima execução, o devedor entra automaticamente no pipeline.</w:t>
-      </w:r>
-    </w:p>
-    <w:p>
-      <w:pPr>
-        <w:pStyle w:val="Heading3"/>
-        <w:spacing w:after="100" w:before="180"/>
-      </w:pPr>
-      <w:r>
-        <w:rPr>
-          <w:b/>
-          <w:bCs/>
-          <w:color w:val="1F3864"/>
-          <w:sz w:val="22"/>
-          <w:szCs w:val="22"/>
-        </w:rPr>
-        <w:t xml:space="preserve">Remover um devedor</w:t>
+        <w:t xml:space="preserve">Atualizar o CLICKUP_ASSIGNEE_IDS no GitHub para apontar para o novo destinatário das tasks.</w:t>
       </w:r>
     </w:p>
     <w:p>
@@ -5306,7 +3918,7 @@
         <w:spacing w:after="80"/>
       </w:pPr>
       <w:r>
-        <w:t xml:space="preserve">Abrir watchlist.csv.</w:t>
+        <w:t xml:space="preserve">Atualizar o EMAIL_TO no monitor.py local (se manter a camada local em uso).</w:t>
       </w:r>
     </w:p>
     <w:p>
@@ -5319,164 +3931,7 @@
         <w:spacing w:after="80"/>
       </w:pPr>
       <w:r>
-        <w:t xml:space="preserve">Apagar a linha do devedor.</w:t>
-      </w:r>
-    </w:p>
-    <w:p>
-      <w:pPr>
-        <w:pStyle w:val="ListParagraph"/>
-        <w:numPr>
-          <w:ilvl w:val="0"/>
-          <w:numId w:val="3"/>
-        </w:numPr>
-        <w:spacing w:after="80"/>
-      </w:pPr>
-      <w:r>
-        <w:t xml:space="preserve">Salvar. Os eventos passados continuam no histórico, só não há novos alertas.</w:t>
-      </w:r>
-    </w:p>
-    <w:p>
-      <w:pPr>
-        <w:pStyle w:val="Heading3"/>
-        <w:spacing w:after="100" w:before="180"/>
-      </w:pPr>
-      <w:r>
-        <w:rPr>
-          <w:b/>
-          <w:bCs/>
-          <w:color w:val="1F3864"/>
-          <w:sz w:val="22"/>
-          <w:szCs w:val="22"/>
-        </w:rPr>
-        <w:t xml:space="preserve">Adicionar um destinatário no e-mail</w:t>
-      </w:r>
-    </w:p>
-    <w:p>
-      <w:pPr>
-        <w:pStyle w:val="ListParagraph"/>
-        <w:numPr>
-          <w:ilvl w:val="0"/>
-          <w:numId w:val="3"/>
-        </w:numPr>
-        <w:spacing w:after="80"/>
-      </w:pPr>
-      <w:r>
-        <w:t xml:space="preserve">Abrir monitor.py em qualquer editor de texto.</w:t>
-      </w:r>
-    </w:p>
-    <w:p>
-      <w:pPr>
-        <w:pStyle w:val="ListParagraph"/>
-        <w:numPr>
-          <w:ilvl w:val="0"/>
-          <w:numId w:val="3"/>
-        </w:numPr>
-        <w:spacing w:after="80"/>
-      </w:pPr>
-      <w:r>
-        <w:t xml:space="preserve">Localizar a linha EMAIL_CC = "" (perto do início do arquivo).</w:t>
-      </w:r>
-    </w:p>
-    <w:p>
-      <w:pPr>
-        <w:pStyle w:val="ListParagraph"/>
-        <w:numPr>
-          <w:ilvl w:val="0"/>
-          <w:numId w:val="3"/>
-        </w:numPr>
-        <w:spacing w:after="80"/>
-      </w:pPr>
-      <w:r>
-        <w:t xml:space="preserve">Substituir por: </w:t>
-      </w:r>
-      <w:r>
-        <w:rPr>
-          <w:rFonts w:ascii="Consolas" w:cs="Consolas" w:eastAsia="Consolas" w:hAnsi="Consolas"/>
-          <w:sz w:val="18"/>
-          <w:szCs w:val="18"/>
-        </w:rPr>
-        <w:t xml:space="preserve">EMAIL_CC = "outra.pessoa@marvin.com.br;outra2@marvin.com.br"</w:t>
-      </w:r>
-    </w:p>
-    <w:p>
-      <w:pPr>
-        <w:pStyle w:val="ListParagraph"/>
-        <w:numPr>
-          <w:ilvl w:val="0"/>
-          <w:numId w:val="3"/>
-        </w:numPr>
-        <w:spacing w:after="80"/>
-      </w:pPr>
-      <w:r>
-        <w:t xml:space="preserve">Salvar. Próxima execução já manda em cópia.</w:t>
-      </w:r>
-    </w:p>
-    <w:p>
-      <w:pPr>
-        <w:pStyle w:val="Heading3"/>
-        <w:spacing w:after="100" w:before="180"/>
-      </w:pPr>
-      <w:r>
-        <w:rPr>
-          <w:b/>
-          <w:bCs/>
-          <w:color w:val="1F3864"/>
-          <w:sz w:val="22"/>
-          <w:szCs w:val="22"/>
-        </w:rPr>
-        <w:t xml:space="preserve">O que checar mensalmente</w:t>
-      </w:r>
-    </w:p>
-    <w:p>
-      <w:pPr>
-        <w:pStyle w:val="ListParagraph"/>
-        <w:numPr>
-          <w:ilvl w:val="0"/>
-          <w:numId w:val="2"/>
-        </w:numPr>
-        <w:spacing w:after="80"/>
-      </w:pPr>
-      <w:r>
-        <w:t xml:space="preserve">Abrir historico_eventos.xlsx e conferir a aba Resumo: nenhuma empresa deveria sumir do mapa abruptamente.</w:t>
-      </w:r>
-    </w:p>
-    <w:p>
-      <w:pPr>
-        <w:pStyle w:val="ListParagraph"/>
-        <w:numPr>
-          <w:ilvl w:val="0"/>
-          <w:numId w:val="2"/>
-        </w:numPr>
-        <w:spacing w:after="80"/>
-      </w:pPr>
-      <w:r>
-        <w:t xml:space="preserve">Conferir a pasta logs/ — deve haver um log para cada dia em que a máquina foi ligada.</w:t>
-      </w:r>
-    </w:p>
-    <w:p>
-      <w:pPr>
-        <w:pStyle w:val="ListParagraph"/>
-        <w:numPr>
-          <w:ilvl w:val="0"/>
-          <w:numId w:val="2"/>
-        </w:numPr>
-        <w:spacing w:after="80"/>
-      </w:pPr>
-      <w:r>
-        <w:t xml:space="preserve">Validar que o e-mail diário continua chegando. Sem e-mail por 3 dias úteis seguidos = investigar.</w:t>
-      </w:r>
-    </w:p>
-    <w:p>
-      <w:pPr>
-        <w:pStyle w:val="ListParagraph"/>
-        <w:numPr>
-          <w:ilvl w:val="0"/>
-          <w:numId w:val="2"/>
-        </w:numPr>
-        <w:spacing w:after="80"/>
-      </w:pPr>
-      <w:r>
-        <w:t xml:space="preserve">Cruzar a watchlist com a lista atual de ICFs ativos — adicionar/remover conforme entrada e saída de operações.</w:t>
+        <w:t xml:space="preserve">Realizar um run manual no GitHub Actions para validar.</w:t>
       </w:r>
     </w:p>
     <w:p>
@@ -5492,7 +3947,7 @@
           <w:sz w:val="24"/>
           <w:szCs w:val="24"/>
         </w:rPr>
-        <w:t xml:space="preserve">5.2. Quem pode operar</w:t>
+        <w:t xml:space="preserve">5.2. Cenário 2: Saída imediata ou emergencial</w:t>
       </w:r>
     </w:p>
     <w:p>
@@ -5500,7 +3955,62 @@
         <w:spacing w:after="120"/>
       </w:pPr>
       <w:r>
-        <w:t xml:space="preserve">Qualquer pessoa do time de Risco com acesso ao computador da responsável atual (ou cópia da pasta) pode operar. A operação rotineira (adicionar/remover devedor, ler e-mail, abrir planilha) não exige conhecimento técnico — basta saber editar um CSV no Excel.</w:t>
+        <w:t xml:space="preserve">Como o repositório vive na organização Marvin, ele não some quando uma pessoa específica deixa a empresa. O TI da Marvin (ou qualquer membro com permissão de Admin na organização) pode promover um novo responsável imediatamente e seguir o procedimento de regeneração do token.</w:t>
+      </w:r>
+    </w:p>
+    <w:p>
+      <w:pPr>
+        <w:pStyle w:val="ListParagraph"/>
+        <w:numPr>
+          <w:ilvl w:val="0"/>
+          <w:numId w:val="3"/>
+        </w:numPr>
+        <w:spacing w:after="80"/>
+      </w:pPr>
+      <w:r>
+        <w:t xml:space="preserve">Admin da organização adiciona o novo responsável como Admin do repositório.</w:t>
+      </w:r>
+    </w:p>
+    <w:p>
+      <w:pPr>
+        <w:pStyle w:val="ListParagraph"/>
+        <w:numPr>
+          <w:ilvl w:val="0"/>
+          <w:numId w:val="3"/>
+        </w:numPr>
+        <w:spacing w:after="80"/>
+      </w:pPr>
+      <w:r>
+        <w:t xml:space="preserve">Novo responsável segue o procedimento de regeneração do token.</w:t>
+      </w:r>
+    </w:p>
+    <w:p>
+      <w:pPr>
+        <w:pStyle w:val="ListParagraph"/>
+        <w:numPr>
+          <w:ilvl w:val="0"/>
+          <w:numId w:val="3"/>
+        </w:numPr>
+        <w:spacing w:after="80"/>
+      </w:pPr>
+      <w:r>
+        <w:t xml:space="preserve">Sistema continua operando, com no máximo um dia de gap (se a regeneração for feita após o cron diário).</w:t>
+      </w:r>
+    </w:p>
+    <w:p>
+      <w:pPr>
+        <w:pStyle w:val="Heading2"/>
+        <w:spacing w:after="120" w:before="220"/>
+      </w:pPr>
+      <w:r>
+        <w:rPr>
+          <w:b/>
+          <w:bCs/>
+          <w:color w:val="2E75B6"/>
+          <w:sz w:val="24"/>
+          <w:szCs w:val="24"/>
+        </w:rPr>
+        <w:t xml:space="preserve">5.3. Cenário 3: Mudança de máquina</w:t>
       </w:r>
     </w:p>
     <w:p>
@@ -5508,7 +4018,31 @@
         <w:spacing w:after="120"/>
       </w:pPr>
       <w:r>
-        <w:t xml:space="preserve">Para mudanças no código (ex.: adicionar nova categoria CVM, mudar regras de classificação, integrar com Slack), exige Python básico. Toda a documentação técnica está no arquivo spec.md dentro da pasta do projeto.</w:t>
+        <w:t xml:space="preserve">Para migrar a camada local para uma máquina diferente, basta clonar o repositório do GitHub Desktop, configurar o atalho da Pasta de Inicialização e instalar as dependências Python. A camada cloud continua funcionando sem qualquer impacto.</w:t>
+      </w:r>
+    </w:p>
+    <w:p>
+      <w:pPr>
+        <w:pStyle w:val="Heading2"/>
+        <w:spacing w:after="120" w:before="220"/>
+      </w:pPr>
+      <w:r>
+        <w:rPr>
+          <w:b/>
+          <w:bCs/>
+          <w:color w:val="2E75B6"/>
+          <w:sz w:val="24"/>
+          <w:szCs w:val="24"/>
+        </w:rPr>
+        <w:t xml:space="preserve">5.4. Tornar 100% autônomo: já feito</w:t>
+      </w:r>
+    </w:p>
+    <w:p>
+      <w:pPr>
+        <w:spacing w:after="120"/>
+      </w:pPr>
+      <w:r>
+        <w:t xml:space="preserve">A camada cloud no GitHub Actions já elimina a dependência de máquina local. O canal oficial é o ClickUp (via task gerada pelo cron). O monitor local foi mantido apenas como redundância e ferramenta pessoal da responsável.</w:t>
       </w:r>
     </w:p>
     <w:p>
@@ -5524,299 +4058,7 @@
           <w:sz w:val="30"/>
           <w:szCs w:val="30"/>
         </w:rPr>
-        <w:t xml:space="preserve">6. Plano de Sucessão</w:t>
-      </w:r>
-    </w:p>
-    <w:p>
-      <w:pPr>
-        <w:spacing w:after="120"/>
-      </w:pPr>
-      <w:r>
-        <w:t xml:space="preserve">Esta seção descreve como manter o monitoramento operacional caso a responsável atual saia da Marvin, seja por troca de função, licença ou desligamento.</w:t>
-      </w:r>
-    </w:p>
-    <w:p>
-      <w:pPr>
-        <w:pStyle w:val="Heading2"/>
-        <w:spacing w:after="120" w:before="220"/>
-      </w:pPr>
-      <w:r>
-        <w:rPr>
-          <w:b/>
-          <w:bCs/>
-          <w:color w:val="2E75B6"/>
-          <w:sz w:val="24"/>
-          <w:szCs w:val="24"/>
-        </w:rPr>
-        <w:t xml:space="preserve">6.1. Cenário 1: Saída programada</w:t>
-      </w:r>
-    </w:p>
-    <w:p>
-      <w:pPr>
-        <w:spacing w:after="120"/>
-      </w:pPr>
-      <w:r>
-        <w:t xml:space="preserve">Com aviso prévio, o handover é simples:</w:t>
-      </w:r>
-    </w:p>
-    <w:p>
-      <w:pPr>
-        <w:pStyle w:val="ListParagraph"/>
-        <w:numPr>
-          <w:ilvl w:val="0"/>
-          <w:numId w:val="3"/>
-        </w:numPr>
-        <w:spacing w:after="80"/>
-      </w:pPr>
-      <w:r>
-        <w:t xml:space="preserve">Identificar o substituto (idealmente alguém do time de Risco).</w:t>
-      </w:r>
-    </w:p>
-    <w:p>
-      <w:pPr>
-        <w:pStyle w:val="ListParagraph"/>
-        <w:numPr>
-          <w:ilvl w:val="0"/>
-          <w:numId w:val="3"/>
-        </w:numPr>
-        <w:spacing w:after="80"/>
-      </w:pPr>
-      <w:r>
-        <w:t xml:space="preserve">Copiar a pasta inteira do projeto para o computador do substituto, no caminho equivalente.</w:t>
-      </w:r>
-    </w:p>
-    <w:p>
-      <w:pPr>
-        <w:pStyle w:val="ListParagraph"/>
-        <w:numPr>
-          <w:ilvl w:val="0"/>
-          <w:numId w:val="3"/>
-        </w:numPr>
-        <w:spacing w:after="80"/>
-      </w:pPr>
-      <w:r>
-        <w:t xml:space="preserve">Instalar Python 3.10+ no novo computador (com 'Add Python to PATH' marcado).</w:t>
-      </w:r>
-    </w:p>
-    <w:p>
-      <w:pPr>
-        <w:pStyle w:val="ListParagraph"/>
-        <w:numPr>
-          <w:ilvl w:val="0"/>
-          <w:numId w:val="3"/>
-        </w:numPr>
-        <w:spacing w:after="80"/>
-      </w:pPr>
-      <w:r>
-        <w:t xml:space="preserve">Rodar uma vez no Prompt de Comando: </w:t>
-      </w:r>
-      <w:r>
-        <w:rPr>
-          <w:rFonts w:ascii="Consolas" w:cs="Consolas" w:eastAsia="Consolas" w:hAnsi="Consolas"/>
-          <w:sz w:val="18"/>
-          <w:szCs w:val="18"/>
-        </w:rPr>
-        <w:t xml:space="preserve">python -m pip install -r requirements.txt</w:t>
-      </w:r>
-    </w:p>
-    <w:p>
-      <w:pPr>
-        <w:pStyle w:val="ListParagraph"/>
-        <w:numPr>
-          <w:ilvl w:val="0"/>
-          <w:numId w:val="3"/>
-        </w:numPr>
-        <w:spacing w:after="80"/>
-      </w:pPr>
-      <w:r>
-        <w:t xml:space="preserve">Editar o run_weekly.bat e atualizar a variável PYTHON_EXE para o caminho real do python.exe na nova máquina.</w:t>
-      </w:r>
-    </w:p>
-    <w:p>
-      <w:pPr>
-        <w:pStyle w:val="ListParagraph"/>
-        <w:numPr>
-          <w:ilvl w:val="0"/>
-          <w:numId w:val="3"/>
-        </w:numPr>
-        <w:spacing w:after="80"/>
-      </w:pPr>
-      <w:r>
-        <w:t xml:space="preserve">Editar a constante EMAIL_TO no monitor.py para o e-mail do novo responsável.</w:t>
-      </w:r>
-    </w:p>
-    <w:p>
-      <w:pPr>
-        <w:pStyle w:val="ListParagraph"/>
-        <w:numPr>
-          <w:ilvl w:val="0"/>
-          <w:numId w:val="3"/>
-        </w:numPr>
-        <w:spacing w:after="80"/>
-      </w:pPr>
-      <w:r>
-        <w:t xml:space="preserve">Criar um atalho do run_weekly.bat dentro da Pasta de Inicialização (shell:startup) do novo computador.</w:t>
-      </w:r>
-    </w:p>
-    <w:p>
-      <w:pPr>
-        <w:pStyle w:val="ListParagraph"/>
-        <w:numPr>
-          <w:ilvl w:val="0"/>
-          <w:numId w:val="3"/>
-        </w:numPr>
-        <w:spacing w:after="80"/>
-      </w:pPr>
-      <w:r>
-        <w:t xml:space="preserve">Rodar uma vez manualmente para validar (python monitor.py --lookback 10). Se receber e-mail, está tudo certo.</w:t>
-      </w:r>
-    </w:p>
-    <w:p>
-      <w:pPr>
-        <w:pStyle w:val="Heading2"/>
-        <w:spacing w:after="120" w:before="220"/>
-      </w:pPr>
-      <w:r>
-        <w:rPr>
-          <w:b/>
-          <w:bCs/>
-          <w:color w:val="2E75B6"/>
-          <w:sz w:val="24"/>
-          <w:szCs w:val="24"/>
-        </w:rPr>
-        <w:t xml:space="preserve">6.2. Cenário 2: Saída imediata ou emergencial</w:t>
-      </w:r>
-    </w:p>
-    <w:p>
-      <w:pPr>
-        <w:spacing w:after="120"/>
-      </w:pPr>
-      <w:r>
-        <w:t xml:space="preserve">Sem handover prévio, o sistema continua rodando enquanto o computador da responsável estiver ligado. Mas inevitavelmente em algum momento ele desliga. Procedimento de recuperação:</w:t>
-      </w:r>
-    </w:p>
-    <w:p>
-      <w:pPr>
-        <w:pStyle w:val="ListParagraph"/>
-        <w:numPr>
-          <w:ilvl w:val="0"/>
-          <w:numId w:val="3"/>
-        </w:numPr>
-        <w:spacing w:after="80"/>
-      </w:pPr>
-      <w:r>
-        <w:t xml:space="preserve">O TI da Marvin acessa o OneDrive da responsável (todos os arquivos do projeto estão lá, sincronizados).</w:t>
-      </w:r>
-    </w:p>
-    <w:p>
-      <w:pPr>
-        <w:pStyle w:val="ListParagraph"/>
-        <w:numPr>
-          <w:ilvl w:val="0"/>
-          <w:numId w:val="3"/>
-        </w:numPr>
-        <w:spacing w:after="80"/>
-      </w:pPr>
-      <w:r>
-        <w:t xml:space="preserve">Copia a pasta 'Monitoramento - Fatos Relevantes' inteira para uma nova máquina ou mantém o histórico.</w:t>
-      </w:r>
-    </w:p>
-    <w:p>
-      <w:pPr>
-        <w:pStyle w:val="ListParagraph"/>
-        <w:numPr>
-          <w:ilvl w:val="0"/>
-          <w:numId w:val="3"/>
-        </w:numPr>
-        <w:spacing w:after="80"/>
-      </w:pPr>
-      <w:r>
-        <w:t xml:space="preserve">Aplica os passos do Cenário 1 acima a partir do passo 3.</w:t>
-      </w:r>
-    </w:p>
-    <w:p>
-      <w:pPr>
-        <w:pStyle w:val="ListParagraph"/>
-        <w:numPr>
-          <w:ilvl w:val="0"/>
-          <w:numId w:val="3"/>
-        </w:numPr>
-        <w:spacing w:after="80"/>
-      </w:pPr>
-      <w:r>
-        <w:t xml:space="preserve">O histórico de eventos não é perdido — historico.csv e o xlsx continuam no OneDrive.</w:t>
-      </w:r>
-    </w:p>
-    <w:p>
-      <w:pPr>
-        <w:pStyle w:val="Heading2"/>
-        <w:spacing w:after="120" w:before="220"/>
-      </w:pPr>
-      <w:r>
-        <w:rPr>
-          <w:b/>
-          <w:bCs/>
-          <w:color w:val="2E75B6"/>
-          <w:sz w:val="24"/>
-          <w:szCs w:val="24"/>
-        </w:rPr>
-        <w:t xml:space="preserve">6.3. Mudança de máquina</w:t>
-      </w:r>
-    </w:p>
-    <w:p>
-      <w:pPr>
-        <w:spacing w:after="120"/>
-      </w:pPr>
-      <w:r>
-        <w:t xml:space="preserve">Para migrar o monitor para uma máquina diferente da atual, os passos são os mesmos do Cenário 1. A pasta do projeto é portátil — sem dependências de banco de dados ou serviços externos. Basta copiar.</w:t>
-      </w:r>
-    </w:p>
-    <w:p>
-      <w:pPr>
-        <w:pStyle w:val="Heading2"/>
-        <w:spacing w:after="120" w:before="220"/>
-      </w:pPr>
-      <w:r>
-        <w:rPr>
-          <w:b/>
-          <w:bCs/>
-          <w:color w:val="2E75B6"/>
-          <w:sz w:val="24"/>
-          <w:szCs w:val="24"/>
-        </w:rPr>
-        <w:t xml:space="preserve">6.4. Tornar o sistema 100% autônomo (Fase 2)</w:t>
-      </w:r>
-    </w:p>
-    <w:p>
-      <w:pPr>
-        <w:spacing w:after="120"/>
-      </w:pPr>
-      <w:r>
-        <w:t xml:space="preserve">A solução atual depende do computador da responsável estar ligado. Para eliminar essa dependência, a evolução natural é migrar a execução para a nuvem, seguindo o mesmo padrão do Monitoramento de Ratings da Marvin (GitHub Actions + ClickUp). Esforço estimado: 1 a 2 semanas de engenharia. Custo: zero (GitHub Actions tem tier gratuito amplo e ClickUp já está contratado).</w:t>
-      </w:r>
-    </w:p>
-    <w:p>
-      <w:pPr>
-        <w:spacing w:after="120"/>
-      </w:pPr>
-      <w:r>
-        <w:t xml:space="preserve">Vantagens da migração: roda sozinho mesmo com qualquer máquina desligada; alertas viram task no ClickUp (igual aos outros monitoramentos); auditoria via Git; testes unitários automatizados; e-mail vem do ClickUp sem dependência de Outlook ou SMTP.</w:t>
-      </w:r>
-    </w:p>
-    <w:p>
-      <w:pPr>
-        <w:pStyle w:val="Heading1"/>
-        <w:spacing w:after="180" w:before="320"/>
-      </w:pPr>
-      <w:r>
-        <w:rPr>
-          <w:b/>
-          <w:bCs/>
-          <w:color w:val="2E75B6"/>
-          <w:sz w:val="30"/>
-          <w:szCs w:val="30"/>
-        </w:rPr>
-        <w:t xml:space="preserve">7. Roadmap de Evoluções</w:t>
+        <w:t xml:space="preserve">6. Roadmap de Evoluções</w:t>
       </w:r>
     </w:p>
     <w:tbl>
@@ -5959,7 +4201,7 @@
                 <w:sz w:val="18"/>
                 <w:szCs w:val="18"/>
               </w:rPr>
-              <w:t xml:space="preserve">1 (atual)</w:t>
+              <w:t xml:space="preserve">Concluída</w:t>
             </w:r>
           </w:p>
         </w:tc>
@@ -5987,7 +4229,7 @@
                 <w:sz w:val="18"/>
                 <w:szCs w:val="18"/>
               </w:rPr>
-              <w:t xml:space="preserve">MVP local rodando na máquina da responsável; fontes CVM IPE; e-mail via Outlook</w:t>
+              <w:t xml:space="preserve">MVP local + cloud, com ClickUp e documentação institucional</w:t>
             </w:r>
           </w:p>
         </w:tc>
@@ -6048,7 +4290,7 @@
                 <w:sz w:val="18"/>
                 <w:szCs w:val="18"/>
               </w:rPr>
-              <w:t xml:space="preserve">2</w:t>
+              <w:t xml:space="preserve">Em andamento</w:t>
             </w:r>
           </w:p>
         </w:tc>
@@ -6076,7 +4318,7 @@
                 <w:sz w:val="18"/>
                 <w:szCs w:val="18"/>
               </w:rPr>
-              <w:t xml:space="preserve">Migração para GitHub Actions + ClickUp (autonomia total da máquina)</w:t>
+              <w:t xml:space="preserve">Comunicação interna, expansão de destinatários, governança formal</w:t>
             </w:r>
           </w:p>
         </w:tc>
@@ -6104,7 +4346,7 @@
                 <w:sz w:val="18"/>
                 <w:szCs w:val="18"/>
               </w:rPr>
-              <w:t xml:space="preserve">1 a 2 semanas eng</w:t>
+              <w:t xml:space="preserve">1 a 2 semanas</w:t>
             </w:r>
           </w:p>
         </w:tc>
@@ -6137,7 +4379,7 @@
                 <w:sz w:val="18"/>
                 <w:szCs w:val="18"/>
               </w:rPr>
-              <w:t xml:space="preserve">2</w:t>
+              <w:t xml:space="preserve">Fase 2A</w:t>
             </w:r>
           </w:p>
         </w:tc>
@@ -6165,7 +4407,7 @@
                 <w:sz w:val="18"/>
                 <w:szCs w:val="18"/>
               </w:rPr>
-              <w:t xml:space="preserve">Cobertura de privados via DataJud (processos judiciais) + DOU (publicações oficiais)</w:t>
+              <w:t xml:space="preserve">Cobertura de devedores privados via DataJud (CNJ) e DOU (Imprensa Nacional)</w:t>
             </w:r>
           </w:p>
         </w:tc>
@@ -6226,7 +4468,7 @@
                 <w:sz w:val="18"/>
                 <w:szCs w:val="18"/>
               </w:rPr>
-              <w:t xml:space="preserve">2</w:t>
+              <w:t xml:space="preserve">Fase 2B (opcional)</w:t>
             </w:r>
           </w:p>
         </w:tc>
@@ -6254,7 +4496,7 @@
                 <w:sz w:val="18"/>
                 <w:szCs w:val="18"/>
               </w:rPr>
-              <w:t xml:space="preserve">Classificação refinada via LLM (Claude Haiku) — reduz falso positivo</w:t>
+              <w:t xml:space="preserve">Classificação refinada via LLM (Claude Haiku ou GPT-4o-mini), sem juízo binário</w:t>
             </w:r>
           </w:p>
         </w:tc>
@@ -6315,7 +4557,7 @@
                 <w:sz w:val="18"/>
                 <w:szCs w:val="18"/>
               </w:rPr>
-              <w:t xml:space="preserve">3</w:t>
+              <w:t xml:space="preserve">Fase 3</w:t>
             </w:r>
           </w:p>
         </w:tc>
@@ -6343,7 +4585,7 @@
                 <w:sz w:val="18"/>
                 <w:szCs w:val="18"/>
               </w:rPr>
-              <w:t xml:space="preserve">Dashboard cliente-facing — credor vê eventos do devedor lado a lado com o ICG</w:t>
+              <w:t xml:space="preserve">Dashboard cliente-facing: eventos do devedor lado a lado com o ICG no widget do credor</w:t>
             </w:r>
           </w:p>
         </w:tc>
@@ -6404,7 +4646,7 @@
                 <w:sz w:val="18"/>
                 <w:szCs w:val="18"/>
               </w:rPr>
-              <w:t xml:space="preserve">3</w:t>
+              <w:t xml:space="preserve">Fase 3 estendida</w:t>
             </w:r>
           </w:p>
         </w:tc>
@@ -6432,7 +4674,7 @@
                 <w:sz w:val="18"/>
                 <w:szCs w:val="18"/>
               </w:rPr>
-              <w:t xml:space="preserve">Integração com bureau (Serasa/Boa Vista) para situação cadastral em tempo real</w:t>
+              <w:t xml:space="preserve">Integração com bureau (Serasa, Boa Vista) para situação cadastral em tempo real</w:t>
             </w:r>
           </w:p>
         </w:tc>
@@ -6460,7 +4702,7 @@
                 <w:sz w:val="18"/>
                 <w:szCs w:val="18"/>
               </w:rPr>
-              <w:t xml:space="preserve">negociação contratual</w:t>
+              <w:t xml:space="preserve">Negociação contratual</w:t>
             </w:r>
           </w:p>
         </w:tc>
@@ -6493,7 +4735,7 @@
                 <w:sz w:val="18"/>
                 <w:szCs w:val="18"/>
               </w:rPr>
-              <w:t xml:space="preserve">3</w:t>
+              <w:t xml:space="preserve">Fase 4</w:t>
             </w:r>
           </w:p>
         </w:tc>
@@ -6521,7 +4763,7 @@
                 <w:sz w:val="18"/>
                 <w:szCs w:val="18"/>
               </w:rPr>
-              <w:t xml:space="preserve">Modelo preditivo de deterioração combinando sinal externo + interno (volume transacional)</w:t>
+              <w:t xml:space="preserve">Modelo preditivo combinando sinal externo (este) + interno (volume transacional proprietário)</w:t>
             </w:r>
           </w:p>
         </w:tc>
@@ -6549,7 +4791,7 @@
                 <w:sz w:val="18"/>
                 <w:szCs w:val="18"/>
               </w:rPr>
-              <w:t xml:space="preserve">ciclo de pesquisa</w:t>
+              <w:t xml:space="preserve">Ciclo de pesquisa</w:t>
             </w:r>
           </w:p>
         </w:tc>
@@ -6568,7 +4810,7 @@
           <w:sz w:val="30"/>
           <w:szCs w:val="30"/>
         </w:rPr>
-        <w:t xml:space="preserve">8. Anexos</w:t>
+        <w:t xml:space="preserve">7. Anexos</w:t>
       </w:r>
     </w:p>
     <w:p>
@@ -6584,7 +4826,7 @@
           <w:sz w:val="24"/>
           <w:szCs w:val="24"/>
         </w:rPr>
-        <w:t xml:space="preserve">8.1. Comandos úteis</w:t>
+        <w:t xml:space="preserve">7.1. Comandos úteis</w:t>
       </w:r>
     </w:p>
     <w:p>
@@ -6592,7 +4834,7 @@
         <w:spacing w:after="120"/>
       </w:pPr>
       <w:r>
-        <w:t xml:space="preserve">Rodar manualmente (sem enviar e-mail):</w:t>
+        <w:t xml:space="preserve">Rodar manualmente o monitor local (sem enviar e-mail):</w:t>
       </w:r>
     </w:p>
     <w:p>
@@ -6614,7 +4856,7 @@
         <w:spacing w:after="120"/>
       </w:pPr>
       <w:r>
-        <w:t xml:space="preserve">Rodar manualmente (com e-mail):</w:t>
+        <w:t xml:space="preserve">Rodar manualmente com e-mail:</w:t>
       </w:r>
     </w:p>
     <w:p>
@@ -6636,7 +4878,7 @@
         <w:spacing w:after="120"/>
       </w:pPr>
       <w:r>
-        <w:t xml:space="preserve">Rodar backfill inicial (60 dias para popular histórico):</w:t>
+        <w:t xml:space="preserve">Backfill inicial (60 dias para popular histórico):</w:t>
       </w:r>
     </w:p>
     <w:p>
@@ -6658,29 +4900,7 @@
         <w:spacing w:after="120"/>
       </w:pPr>
       <w:r>
-        <w:t xml:space="preserve">Listar empresas mais ativas no IPE da CVM (descobrir CNPJs corretos):</w:t>
-      </w:r>
-    </w:p>
-    <w:p>
-      <w:pPr>
-        <w:shd w:fill="F2F2F2" w:val="clear"/>
-        <w:spacing w:after="160" w:before="60"/>
-      </w:pPr>
-      <w:r>
-        <w:rPr>
-          <w:rFonts w:ascii="Consolas" w:cs="Consolas" w:eastAsia="Consolas" w:hAnsi="Consolas"/>
-          <w:sz w:val="18"/>
-          <w:szCs w:val="18"/>
-        </w:rPr>
-        <w:t xml:space="preserve">python listar_emissores.py</w:t>
-      </w:r>
-    </w:p>
-    <w:p>
-      <w:pPr>
-        <w:spacing w:after="120"/>
-      </w:pPr>
-      <w:r>
-        <w:t xml:space="preserve">Reinstalar dependências (caso a máquina seja trocada):</w:t>
+        <w:t xml:space="preserve">Reinstalar dependências:</w:t>
       </w:r>
     </w:p>
     <w:p>
@@ -6710,7 +4930,7 @@
           <w:sz w:val="24"/>
           <w:szCs w:val="24"/>
         </w:rPr>
-        <w:t xml:space="preserve">8.2. Documentação relacionada</w:t>
+        <w:t xml:space="preserve">7.2. Documentação relacionada</w:t>
       </w:r>
     </w:p>
     <w:p>
@@ -6723,7 +4943,7 @@
         <w:spacing w:after="80"/>
       </w:pPr>
       <w:r>
-        <w:t xml:space="preserve">Manual técnico no padrão Marvin: 2026.04.24 - Monitoramento Automatico - Fatos Relevantes CVM.pdf (mesma pasta deste relatório)</w:t>
+        <w:t xml:space="preserve">Manual técnico (padrão Marvin): docs/2026.04.24 - Monitoramento Automatico - Fatos Relevantes CVM.pdf</w:t>
       </w:r>
     </w:p>
     <w:p>
@@ -6736,7 +4956,7 @@
         <w:spacing w:after="80"/>
       </w:pPr>
       <w:r>
-        <w:t xml:space="preserve">Especificação técnica: spec.md (na raiz da pasta do projeto)</w:t>
+        <w:t xml:space="preserve">Working Plan da implementação institucional: docs/Working Plan - Monitoramento CVM Fatos Relevantes.docx</w:t>
       </w:r>
     </w:p>
     <w:p>
@@ -6749,7 +4969,7 @@
         <w:spacing w:after="80"/>
       </w:pPr>
       <w:r>
-        <w:t xml:space="preserve">README operacional: README.md</w:t>
+        <w:t xml:space="preserve">Procedimento de regeneração do token ClickUp: PROCEDIMENTO-Regeneracao-Token-ClickUp.md</w:t>
       </w:r>
     </w:p>
     <w:p>
@@ -6762,7 +4982,7 @@
         <w:spacing w:after="80"/>
       </w:pPr>
       <w:r>
-        <w:t xml:space="preserve">Instruções para Agendador de Tarefas: AGENDAMENTO.md</w:t>
+        <w:t xml:space="preserve">Modelo de comunicação interna: docs/COMUNICACAO-Interna-Anuncio-Canal.md</w:t>
       </w:r>
     </w:p>
     <w:p>
@@ -6775,7 +4995,7 @@
         <w:spacing w:after="80"/>
       </w:pPr>
       <w:r>
-        <w:t xml:space="preserve">Manuais dos outros monitoramentos da Marvin (Poderes, JUCESP, Ratings) — pasta superior</w:t>
+        <w:t xml:space="preserve">Manuais técnicos dos outros monitoramentos Marvin (Poderes, JUCESP, Ratings) — pasta superior.</w:t>
       </w:r>
     </w:p>
     <w:p>
@@ -6791,7 +5011,7 @@
           <w:sz w:val="24"/>
           <w:szCs w:val="24"/>
         </w:rPr>
-        <w:t xml:space="preserve">8.3. Referências regulatórias e técnicas</w:t>
+        <w:t xml:space="preserve">7.3. Referências regulatórias e técnicas</w:t>
       </w:r>
     </w:p>
     <w:p>
@@ -6831,6 +5051,19 @@
       </w:pPr>
       <w:r>
         <w:t xml:space="preserve">Sistema RAD (Recebimento de Documentos) da CVM: www.rad.cvm.gov.br</w:t>
+      </w:r>
+    </w:p>
+    <w:p>
+      <w:pPr>
+        <w:pStyle w:val="ListParagraph"/>
+        <w:numPr>
+          <w:ilvl w:val="0"/>
+          <w:numId w:val="2"/>
+        </w:numPr>
+        <w:spacing w:after="80"/>
+      </w:pPr>
+      <w:r>
+        <w:t xml:space="preserve">Repositório do projeto: github.com/marvin-monitoramento/marvin-cvm-fatos-relevantes</w:t>
       </w:r>
     </w:p>
     <w:p>
@@ -6846,7 +5079,7 @@
           <w:sz w:val="24"/>
           <w:szCs w:val="24"/>
         </w:rPr>
-        <w:t xml:space="preserve">8.4. Decisões importantes registradas</w:t>
+        <w:t xml:space="preserve">7.4. Decisões editoriais registradas</w:t>
       </w:r>
     </w:p>
     <w:p>
@@ -6859,14 +5092,7 @@
         <w:spacing w:after="80"/>
       </w:pPr>
       <w:r>
-        <w:rPr>
-          <w:b/>
-          <w:bCs/>
-        </w:rPr>
-        <w:t xml:space="preserve">Matching por raiz de CNPJ: </w:t>
-      </w:r>
-      <w:r>
-        <w:t xml:space="preserve">a CVM registra eventos pela matriz da companhia listada (geralmente /0001-XX), enquanto os ICFs da Marvin frequentemente apontam para filiais. Comparar pelos 8 primeiros dígitos resolve essa fricção sem precisar adivinhar o CNPJ exato.</w:t>
+        <w:t xml:space="preserve">Materialidade removida das saídas visíveis: a critério da responsável, para evitar viés interpretativo automatizado. Decisão tomada em Maio/2026 após observação de que classificações binárias podem tirar a leitura crítica de cada caso.</w:t>
       </w:r>
     </w:p>
     <w:p>
@@ -6879,14 +5105,7 @@
         <w:spacing w:after="80"/>
       </w:pPr>
       <w:r>
-        <w:rPr>
-          <w:b/>
-          <w:bCs/>
-        </w:rPr>
-        <w:t xml:space="preserve">Dedup por fingerprint SHA-256: </w:t>
-      </w:r>
-      <w:r>
-        <w:t xml:space="preserve">escolhido em vez de chave composta porque é estável a pequenas variações de formatação e protege contra realimentações com lookback sobreposto.</w:t>
+        <w:t xml:space="preserve">Matching por raiz de CNPJ: captura matriz e filiais com a mesma regra, sem necessidade de manter mapa explícito.</w:t>
       </w:r>
     </w:p>
     <w:p>
@@ -6899,14 +5118,7 @@
         <w:spacing w:after="80"/>
       </w:pPr>
       <w:r>
-        <w:rPr>
-          <w:b/>
-          <w:bCs/>
-        </w:rPr>
-        <w:t xml:space="preserve">Lookback default de 10 dias: </w:t>
-      </w:r>
-      <w:r>
-        <w:t xml:space="preserve">compromisso entre cobertura (recuperar dias perdidos por máquina desligada) e custo (volume de filtragem). Pode ser ajustado pela flag --lookback.</w:t>
+        <w:t xml:space="preserve">Dedup por fingerprint SHA-256: escolhido pela estabilidade a pequenas variações de formatação e robustez a sobreposição de janelas.</w:t>
       </w:r>
     </w:p>
     <w:p>
@@ -6919,14 +5131,20 @@
         <w:spacing w:after="80"/>
       </w:pPr>
       <w:r>
-        <w:rPr>
-          <w:b/>
-          <w:bCs/>
-        </w:rPr>
-        <w:t xml:space="preserve">E-mail via Outlook (pywin32): </w:t>
-      </w:r>
-      <w:r>
-        <w:t xml:space="preserve">escolhido em detrimento de SMTP/App Password por simplicidade — não exige senhas, autenticação multifator, nem configuração no servidor da Marvin. Mesmo padrão do Monitoramento de Poderes/JUCESP.</w:t>
+        <w:t xml:space="preserve">Lookback padrão de 10 dias: compromisso entre cobertura (dias perdidos por falha) e custo (volume de processamento).</w:t>
+      </w:r>
+    </w:p>
+    <w:p>
+      <w:pPr>
+        <w:pStyle w:val="ListParagraph"/>
+        <w:numPr>
+          <w:ilvl w:val="0"/>
+          <w:numId w:val="2"/>
+        </w:numPr>
+        <w:spacing w:after="80"/>
+      </w:pPr>
+      <w:r>
+        <w:t xml:space="preserve">Notificação via Outlook (local) e ClickUp (cloud): escolhidas por simplicidade — sem dependência de SMTP, sem necessidade de App Password.</w:t>
       </w:r>
     </w:p>
     <w:sectPr>

</xml_diff>